<commit_message>
es lint and rule added
</commit_message>
<xml_diff>
--- a/UniFit-unit-tests.docx
+++ b/UniFit-unit-tests.docx
@@ -114,7 +114,7 @@
           <w:szCs w:val="28"/>
           <w:lang w:val="en-US"/>
         </w:rPr>
-        <w:t>2</w:t>
+        <w:t>3</w:t>
       </w:r>
       <w:r>
         <w:rPr>
@@ -134,7 +134,7 @@
           <w:szCs w:val="28"/>
           <w:lang w:val="lt-LT"/>
         </w:rPr>
-        <w:t>Vienetų testavimas</w:t>
+        <w:t>Statinė kodo analizė</w:t>
       </w:r>
       <w:r>
         <w:rPr>
@@ -332,9 +332,8 @@
       <w:pPr>
         <w:jc w:val="right"/>
         <w:rPr>
-          <w:sz w:val="28"/>
-          <w:szCs w:val="28"/>
-          <w:lang w:val="lt-LT"/>
+          <w:sz w:val="24"/>
+          <w:szCs w:val="24"/>
         </w:rPr>
       </w:pPr>
       <w:r>
@@ -348,6 +347,598 @@
     <w:p>
       <w:pPr>
         <w:rPr>
+          <w:sz w:val="24"/>
+          <w:szCs w:val="24"/>
+        </w:rPr>
+      </w:pPr>
+      <w:r>
+        <w:rPr>
+          <w:sz w:val="24"/>
+          <w:szCs w:val="24"/>
+        </w:rPr>
+        <w:br w:type="page"/>
+      </w:r>
+    </w:p>
+    <w:sdt>
+      <w:sdtPr>
+        <w:rPr>
+          <w:lang w:val="lt-LT"/>
+        </w:rPr>
+        <w:id w:val="635772985"/>
+        <w:docPartObj>
+          <w:docPartGallery w:val="Table of Contents"/>
+          <w:docPartUnique/>
+        </w:docPartObj>
+      </w:sdtPr>
+      <w:sdtEndPr>
+        <w:rPr>
+          <w:rFonts w:asciiTheme="minorHAnsi" w:eastAsiaTheme="minorHAnsi" w:hAnsiTheme="minorHAnsi" w:cstheme="minorBidi"/>
+          <w:b/>
+          <w:bCs/>
+          <w:color w:val="auto"/>
+          <w:sz w:val="22"/>
+          <w:szCs w:val="22"/>
+          <w:lang w:val="fr-FR"/>
+        </w:rPr>
+      </w:sdtEndPr>
+      <w:sdtContent>
+        <w:p>
+          <w:pPr>
+            <w:pStyle w:val="Turinioantrat"/>
+          </w:pPr>
+          <w:r>
+            <w:rPr>
+              <w:lang w:val="lt-LT"/>
+            </w:rPr>
+            <w:t>Turinys</w:t>
+          </w:r>
+        </w:p>
+        <w:p>
+          <w:pPr>
+            <w:pStyle w:val="Turinys1"/>
+            <w:tabs>
+              <w:tab w:val="right" w:leader="dot" w:pos="9062"/>
+            </w:tabs>
+            <w:rPr>
+              <w:rFonts w:eastAsiaTheme="minorEastAsia"/>
+              <w:noProof/>
+              <w:kern w:val="2"/>
+              <w:sz w:val="24"/>
+              <w:szCs w:val="24"/>
+              <w:lang w:val="lt-LT" w:eastAsia="lt-LT"/>
+              <w14:ligatures w14:val="standardContextual"/>
+            </w:rPr>
+          </w:pPr>
+          <w:r>
+            <w:fldChar w:fldCharType="begin"/>
+          </w:r>
+          <w:r>
+            <w:instrText xml:space="preserve"> TOC \o "1-3" \h \z \u </w:instrText>
+          </w:r>
+          <w:r>
+            <w:fldChar w:fldCharType="separate"/>
+          </w:r>
+          <w:hyperlink w:anchor="_Toc182231106" w:history="1">
+            <w:r>
+              <w:rPr>
+                <w:rStyle w:val="Hipersaitas"/>
+                <w:noProof/>
+              </w:rPr>
+              <w:t>Įvadas</w:t>
+            </w:r>
+            <w:r>
+              <w:rPr>
+                <w:noProof/>
+                <w:webHidden/>
+              </w:rPr>
+              <w:tab/>
+            </w:r>
+            <w:r>
+              <w:rPr>
+                <w:noProof/>
+                <w:webHidden/>
+              </w:rPr>
+              <w:fldChar w:fldCharType="begin"/>
+            </w:r>
+            <w:r>
+              <w:rPr>
+                <w:noProof/>
+                <w:webHidden/>
+              </w:rPr>
+              <w:instrText xml:space="preserve"> PAGEREF _Toc182231106 \h </w:instrText>
+            </w:r>
+            <w:r>
+              <w:rPr>
+                <w:noProof/>
+                <w:webHidden/>
+              </w:rPr>
+            </w:r>
+            <w:r>
+              <w:rPr>
+                <w:noProof/>
+                <w:webHidden/>
+              </w:rPr>
+              <w:fldChar w:fldCharType="separate"/>
+            </w:r>
+            <w:r>
+              <w:rPr>
+                <w:noProof/>
+                <w:webHidden/>
+              </w:rPr>
+              <w:t>3</w:t>
+            </w:r>
+            <w:r>
+              <w:rPr>
+                <w:noProof/>
+                <w:webHidden/>
+              </w:rPr>
+              <w:fldChar w:fldCharType="end"/>
+            </w:r>
+          </w:hyperlink>
+        </w:p>
+        <w:p>
+          <w:pPr>
+            <w:pStyle w:val="Turinys1"/>
+            <w:tabs>
+              <w:tab w:val="right" w:leader="dot" w:pos="9062"/>
+            </w:tabs>
+            <w:rPr>
+              <w:rFonts w:eastAsiaTheme="minorEastAsia"/>
+              <w:noProof/>
+              <w:kern w:val="2"/>
+              <w:sz w:val="24"/>
+              <w:szCs w:val="24"/>
+              <w:lang w:val="lt-LT" w:eastAsia="lt-LT"/>
+              <w14:ligatures w14:val="standardContextual"/>
+            </w:rPr>
+          </w:pPr>
+          <w:hyperlink w:anchor="_Toc182231107" w:history="1">
+            <w:r>
+              <w:rPr>
+                <w:rStyle w:val="Hipersaitas"/>
+                <w:noProof/>
+              </w:rPr>
+              <w:t>Pasirinkti įrankiai</w:t>
+            </w:r>
+            <w:r>
+              <w:rPr>
+                <w:noProof/>
+                <w:webHidden/>
+              </w:rPr>
+              <w:tab/>
+            </w:r>
+            <w:r>
+              <w:rPr>
+                <w:noProof/>
+                <w:webHidden/>
+              </w:rPr>
+              <w:fldChar w:fldCharType="begin"/>
+            </w:r>
+            <w:r>
+              <w:rPr>
+                <w:noProof/>
+                <w:webHidden/>
+              </w:rPr>
+              <w:instrText xml:space="preserve"> PAGEREF _Toc182231107 \h </w:instrText>
+            </w:r>
+            <w:r>
+              <w:rPr>
+                <w:noProof/>
+                <w:webHidden/>
+              </w:rPr>
+            </w:r>
+            <w:r>
+              <w:rPr>
+                <w:noProof/>
+                <w:webHidden/>
+              </w:rPr>
+              <w:fldChar w:fldCharType="separate"/>
+            </w:r>
+            <w:r>
+              <w:rPr>
+                <w:noProof/>
+                <w:webHidden/>
+              </w:rPr>
+              <w:t>4</w:t>
+            </w:r>
+            <w:r>
+              <w:rPr>
+                <w:noProof/>
+                <w:webHidden/>
+              </w:rPr>
+              <w:fldChar w:fldCharType="end"/>
+            </w:r>
+          </w:hyperlink>
+        </w:p>
+        <w:p>
+          <w:pPr>
+            <w:pStyle w:val="Turinys1"/>
+            <w:tabs>
+              <w:tab w:val="right" w:leader="dot" w:pos="9062"/>
+            </w:tabs>
+            <w:rPr>
+              <w:rFonts w:eastAsiaTheme="minorEastAsia"/>
+              <w:noProof/>
+              <w:kern w:val="2"/>
+              <w:sz w:val="24"/>
+              <w:szCs w:val="24"/>
+              <w:lang w:val="lt-LT" w:eastAsia="lt-LT"/>
+              <w14:ligatures w14:val="standardContextual"/>
+            </w:rPr>
+          </w:pPr>
+          <w:hyperlink w:anchor="_Toc182231108" w:history="1">
+            <w:r>
+              <w:rPr>
+                <w:rStyle w:val="Hipersaitas"/>
+                <w:noProof/>
+                <w:lang w:val="lt-LT"/>
+              </w:rPr>
+              <w:t>Kodo peržiūra</w:t>
+            </w:r>
+            <w:r>
+              <w:rPr>
+                <w:noProof/>
+                <w:webHidden/>
+              </w:rPr>
+              <w:tab/>
+            </w:r>
+            <w:r>
+              <w:rPr>
+                <w:noProof/>
+                <w:webHidden/>
+              </w:rPr>
+              <w:fldChar w:fldCharType="begin"/>
+            </w:r>
+            <w:r>
+              <w:rPr>
+                <w:noProof/>
+                <w:webHidden/>
+              </w:rPr>
+              <w:instrText xml:space="preserve"> PAGEREF _Toc182231108 \h </w:instrText>
+            </w:r>
+            <w:r>
+              <w:rPr>
+                <w:noProof/>
+                <w:webHidden/>
+              </w:rPr>
+            </w:r>
+            <w:r>
+              <w:rPr>
+                <w:noProof/>
+                <w:webHidden/>
+              </w:rPr>
+              <w:fldChar w:fldCharType="separate"/>
+            </w:r>
+            <w:r>
+              <w:rPr>
+                <w:noProof/>
+                <w:webHidden/>
+              </w:rPr>
+              <w:t>5</w:t>
+            </w:r>
+            <w:r>
+              <w:rPr>
+                <w:noProof/>
+                <w:webHidden/>
+              </w:rPr>
+              <w:fldChar w:fldCharType="end"/>
+            </w:r>
+          </w:hyperlink>
+        </w:p>
+        <w:p>
+          <w:pPr>
+            <w:pStyle w:val="Turinys1"/>
+            <w:tabs>
+              <w:tab w:val="right" w:leader="dot" w:pos="9062"/>
+            </w:tabs>
+            <w:rPr>
+              <w:rFonts w:eastAsiaTheme="minorEastAsia"/>
+              <w:noProof/>
+              <w:kern w:val="2"/>
+              <w:sz w:val="24"/>
+              <w:szCs w:val="24"/>
+              <w:lang w:val="lt-LT" w:eastAsia="lt-LT"/>
+              <w14:ligatures w14:val="standardContextual"/>
+            </w:rPr>
+          </w:pPr>
+          <w:hyperlink w:anchor="_Toc182231109" w:history="1">
+            <w:r>
+              <w:rPr>
+                <w:rStyle w:val="Hipersaitas"/>
+                <w:noProof/>
+                <w:lang w:val="lt-LT"/>
+              </w:rPr>
+              <w:t>Statinė kodo analizė</w:t>
+            </w:r>
+            <w:r>
+              <w:rPr>
+                <w:noProof/>
+                <w:webHidden/>
+              </w:rPr>
+              <w:tab/>
+            </w:r>
+            <w:r>
+              <w:rPr>
+                <w:noProof/>
+                <w:webHidden/>
+              </w:rPr>
+              <w:fldChar w:fldCharType="begin"/>
+            </w:r>
+            <w:r>
+              <w:rPr>
+                <w:noProof/>
+                <w:webHidden/>
+              </w:rPr>
+              <w:instrText xml:space="preserve"> PAGEREF _Toc182231109 \h </w:instrText>
+            </w:r>
+            <w:r>
+              <w:rPr>
+                <w:noProof/>
+                <w:webHidden/>
+              </w:rPr>
+            </w:r>
+            <w:r>
+              <w:rPr>
+                <w:noProof/>
+                <w:webHidden/>
+              </w:rPr>
+              <w:fldChar w:fldCharType="separate"/>
+            </w:r>
+            <w:r>
+              <w:rPr>
+                <w:noProof/>
+                <w:webHidden/>
+              </w:rPr>
+              <w:t>6</w:t>
+            </w:r>
+            <w:r>
+              <w:rPr>
+                <w:noProof/>
+                <w:webHidden/>
+              </w:rPr>
+              <w:fldChar w:fldCharType="end"/>
+            </w:r>
+          </w:hyperlink>
+        </w:p>
+        <w:p>
+          <w:pPr>
+            <w:pStyle w:val="Turinys1"/>
+            <w:tabs>
+              <w:tab w:val="right" w:leader="dot" w:pos="9062"/>
+            </w:tabs>
+            <w:rPr>
+              <w:rFonts w:eastAsiaTheme="minorEastAsia"/>
+              <w:noProof/>
+              <w:kern w:val="2"/>
+              <w:sz w:val="24"/>
+              <w:szCs w:val="24"/>
+              <w:lang w:val="lt-LT" w:eastAsia="lt-LT"/>
+              <w14:ligatures w14:val="standardContextual"/>
+            </w:rPr>
+          </w:pPr>
+          <w:hyperlink w:anchor="_Toc182231110" w:history="1">
+            <w:r>
+              <w:rPr>
+                <w:rStyle w:val="Hipersaitas"/>
+                <w:noProof/>
+                <w:lang w:val="lt-LT"/>
+              </w:rPr>
+              <w:t>Statinės kodo analizės taisyklės</w:t>
+            </w:r>
+            <w:r>
+              <w:rPr>
+                <w:noProof/>
+                <w:webHidden/>
+              </w:rPr>
+              <w:tab/>
+            </w:r>
+            <w:r>
+              <w:rPr>
+                <w:noProof/>
+                <w:webHidden/>
+              </w:rPr>
+              <w:fldChar w:fldCharType="begin"/>
+            </w:r>
+            <w:r>
+              <w:rPr>
+                <w:noProof/>
+                <w:webHidden/>
+              </w:rPr>
+              <w:instrText xml:space="preserve"> PAGEREF _Toc182231110 \h </w:instrText>
+            </w:r>
+            <w:r>
+              <w:rPr>
+                <w:noProof/>
+                <w:webHidden/>
+              </w:rPr>
+            </w:r>
+            <w:r>
+              <w:rPr>
+                <w:noProof/>
+                <w:webHidden/>
+              </w:rPr>
+              <w:fldChar w:fldCharType="separate"/>
+            </w:r>
+            <w:r>
+              <w:rPr>
+                <w:noProof/>
+                <w:webHidden/>
+              </w:rPr>
+              <w:t>7</w:t>
+            </w:r>
+            <w:r>
+              <w:rPr>
+                <w:noProof/>
+                <w:webHidden/>
+              </w:rPr>
+              <w:fldChar w:fldCharType="end"/>
+            </w:r>
+          </w:hyperlink>
+        </w:p>
+        <w:p>
+          <w:pPr>
+            <w:pStyle w:val="Turinys1"/>
+            <w:tabs>
+              <w:tab w:val="right" w:leader="dot" w:pos="9062"/>
+            </w:tabs>
+            <w:rPr>
+              <w:rFonts w:eastAsiaTheme="minorEastAsia"/>
+              <w:noProof/>
+              <w:kern w:val="2"/>
+              <w:sz w:val="24"/>
+              <w:szCs w:val="24"/>
+              <w:lang w:val="lt-LT" w:eastAsia="lt-LT"/>
+              <w14:ligatures w14:val="standardContextual"/>
+            </w:rPr>
+          </w:pPr>
+          <w:hyperlink w:anchor="_Toc182231111" w:history="1">
+            <w:r>
+              <w:rPr>
+                <w:rStyle w:val="Hipersaitas"/>
+                <w:noProof/>
+                <w:lang w:val="lt-LT"/>
+              </w:rPr>
+              <w:t>Išvados</w:t>
+            </w:r>
+            <w:r>
+              <w:rPr>
+                <w:noProof/>
+                <w:webHidden/>
+              </w:rPr>
+              <w:tab/>
+            </w:r>
+            <w:r>
+              <w:rPr>
+                <w:noProof/>
+                <w:webHidden/>
+              </w:rPr>
+              <w:fldChar w:fldCharType="begin"/>
+            </w:r>
+            <w:r>
+              <w:rPr>
+                <w:noProof/>
+                <w:webHidden/>
+              </w:rPr>
+              <w:instrText xml:space="preserve"> PAGEREF _Toc182231111 \h </w:instrText>
+            </w:r>
+            <w:r>
+              <w:rPr>
+                <w:noProof/>
+                <w:webHidden/>
+              </w:rPr>
+            </w:r>
+            <w:r>
+              <w:rPr>
+                <w:noProof/>
+                <w:webHidden/>
+              </w:rPr>
+              <w:fldChar w:fldCharType="separate"/>
+            </w:r>
+            <w:r>
+              <w:rPr>
+                <w:noProof/>
+                <w:webHidden/>
+              </w:rPr>
+              <w:t>8</w:t>
+            </w:r>
+            <w:r>
+              <w:rPr>
+                <w:noProof/>
+                <w:webHidden/>
+              </w:rPr>
+              <w:fldChar w:fldCharType="end"/>
+            </w:r>
+          </w:hyperlink>
+        </w:p>
+        <w:p>
+          <w:pPr>
+            <w:pStyle w:val="Turinys1"/>
+            <w:tabs>
+              <w:tab w:val="right" w:leader="dot" w:pos="9062"/>
+            </w:tabs>
+            <w:rPr>
+              <w:rFonts w:eastAsiaTheme="minorEastAsia"/>
+              <w:noProof/>
+              <w:kern w:val="2"/>
+              <w:sz w:val="24"/>
+              <w:szCs w:val="24"/>
+              <w:lang w:val="lt-LT" w:eastAsia="lt-LT"/>
+              <w14:ligatures w14:val="standardContextual"/>
+            </w:rPr>
+          </w:pPr>
+          <w:hyperlink w:anchor="_Toc182231112" w:history="1">
+            <w:r>
+              <w:rPr>
+                <w:rStyle w:val="Hipersaitas"/>
+                <w:noProof/>
+                <w:lang w:val="lt-LT"/>
+              </w:rPr>
+              <w:t>Šaltiniai</w:t>
+            </w:r>
+            <w:r>
+              <w:rPr>
+                <w:noProof/>
+                <w:webHidden/>
+              </w:rPr>
+              <w:tab/>
+            </w:r>
+            <w:r>
+              <w:rPr>
+                <w:noProof/>
+                <w:webHidden/>
+              </w:rPr>
+              <w:fldChar w:fldCharType="begin"/>
+            </w:r>
+            <w:r>
+              <w:rPr>
+                <w:noProof/>
+                <w:webHidden/>
+              </w:rPr>
+              <w:instrText xml:space="preserve"> PAGEREF _Toc182231112 \h </w:instrText>
+            </w:r>
+            <w:r>
+              <w:rPr>
+                <w:noProof/>
+                <w:webHidden/>
+              </w:rPr>
+            </w:r>
+            <w:r>
+              <w:rPr>
+                <w:noProof/>
+                <w:webHidden/>
+              </w:rPr>
+              <w:fldChar w:fldCharType="separate"/>
+            </w:r>
+            <w:r>
+              <w:rPr>
+                <w:noProof/>
+                <w:webHidden/>
+              </w:rPr>
+              <w:t>9</w:t>
+            </w:r>
+            <w:r>
+              <w:rPr>
+                <w:noProof/>
+                <w:webHidden/>
+              </w:rPr>
+              <w:fldChar w:fldCharType="end"/>
+            </w:r>
+          </w:hyperlink>
+        </w:p>
+        <w:p>
+          <w:r>
+            <w:rPr>
+              <w:b/>
+              <w:bCs/>
+            </w:rPr>
+            <w:fldChar w:fldCharType="end"/>
+          </w:r>
+        </w:p>
+      </w:sdtContent>
+    </w:sdt>
+    <w:p>
+      <w:pPr>
+        <w:rPr>
           <w:rFonts w:ascii="Times New Roman" w:hAnsi="Times New Roman" w:cs="Times New Roman"/>
           <w:sz w:val="24"/>
           <w:szCs w:val="24"/>
@@ -366,3159 +957,300 @@
         </w:rPr>
         <w:br w:type="page"/>
       </w:r>
+    </w:p>
+    <w:p>
+      <w:pPr>
+        <w:pStyle w:val="Antrat1"/>
+        <w:jc w:val="center"/>
+      </w:pPr>
+      <w:bookmarkStart w:id="0" w:name="_Toc182231106"/>
       <w:r>
         <w:lastRenderedPageBreak/>
-        <w:t>Vienetinių Testų Dokumentacij</w:t>
+        <w:t>Įvadas</w:t>
       </w:r>
+      <w:bookmarkEnd w:id="0"/>
+    </w:p>
+    <w:p/>
+    <w:p/>
+    <w:p>
       <w:r>
-        <w:t>a</w:t>
+        <w:br w:type="page"/>
       </w:r>
     </w:p>
     <w:p>
       <w:pPr>
-        <w:rPr>
-          <w:lang w:val="en-US"/>
-        </w:rPr>
-      </w:pPr>
+        <w:pStyle w:val="Antrat1"/>
+        <w:jc w:val="center"/>
+      </w:pPr>
+      <w:bookmarkStart w:id="1" w:name="_Toc182231107"/>
       <w:r>
-        <w:t xml:space="preserve">Svarbiau padengti unit testai backend koda </w:t>
+        <w:lastRenderedPageBreak/>
+        <w:t>Pasirinkti įrankiai</w:t>
+      </w:r>
+      <w:bookmarkEnd w:id="1"/>
+    </w:p>
+    <w:p>
+      <w:pPr>
+        <w:rPr>
+          <w:lang w:val="lt-LT"/>
+        </w:rPr>
+      </w:pPr>
+      <w:r>
+        <w:t xml:space="preserve">Pasirinktas </w:t>
       </w:r>
       <w:r>
         <w:rPr>
           <w:lang w:val="en-US"/>
         </w:rPr>
-        <w:t xml:space="preserve">100% </w:t>
+        <w:t>“Lint” statin</w:t>
+      </w:r>
+      <w:r>
+        <w:rPr>
+          <w:lang w:val="lt-LT"/>
+        </w:rPr>
+        <w:t xml:space="preserve">ės kodo analizės įrankis, dėl lengvo pritaikymo su mūsų </w:t>
       </w:r>
       <w:proofErr w:type="spellStart"/>
       <w:r>
         <w:rPr>
-          <w:lang w:val="en-US"/>
-        </w:rPr>
-        <w:t>padengta</w:t>
+          <w:lang w:val="lt-LT"/>
+        </w:rPr>
+        <w:t>Typescript</w:t>
       </w:r>
       <w:proofErr w:type="spellEnd"/>
       <w:r>
         <w:rPr>
-          <w:lang w:val="en-US"/>
-        </w:rPr>
-        <w:t>,</w:t>
+          <w:lang w:val="lt-LT"/>
+        </w:rPr>
+        <w:t xml:space="preserve"> kodu.</w:t>
       </w:r>
     </w:p>
     <w:p>
       <w:pPr>
         <w:rPr>
-          <w:lang w:val="en-US"/>
-        </w:rPr>
-      </w:pPr>
-    </w:p>
-    <w:p/>
-    <w:tbl>
-      <w:tblPr>
-        <w:tblStyle w:val="Lentelstinklelis"/>
-        <w:tblW w:w="0" w:type="auto"/>
-        <w:tblLook w:val="04A0" w:firstRow="1" w:lastRow="0" w:firstColumn="1" w:lastColumn="0" w:noHBand="0" w:noVBand="1"/>
-      </w:tblPr>
-      <w:tblGrid>
-        <w:gridCol w:w="1334"/>
-        <w:gridCol w:w="1723"/>
-        <w:gridCol w:w="1668"/>
-        <w:gridCol w:w="1701"/>
-        <w:gridCol w:w="2636"/>
-      </w:tblGrid>
-      <w:tr>
-        <w:tc>
-          <w:tcPr>
-            <w:tcW w:w="1812" w:type="dxa"/>
-            <w:shd w:val="clear" w:color="auto" w:fill="92D050"/>
-          </w:tcPr>
-          <w:p>
-            <w:pPr>
-              <w:jc w:val="center"/>
-              <w:rPr>
-                <w:b/>
-                <w:bCs/>
-                <w:sz w:val="24"/>
-                <w:szCs w:val="24"/>
-                <w:lang w:val="lt-LT"/>
-              </w:rPr>
-            </w:pPr>
-            <w:r>
-              <w:rPr>
-                <w:b/>
-                <w:bCs/>
-                <w:sz w:val="24"/>
-                <w:szCs w:val="24"/>
-              </w:rPr>
-              <w:t>Testo ID</w:t>
-            </w:r>
-          </w:p>
-        </w:tc>
-        <w:tc>
-          <w:tcPr>
-            <w:tcW w:w="1812" w:type="dxa"/>
-            <w:shd w:val="clear" w:color="auto" w:fill="92D050"/>
-          </w:tcPr>
-          <w:p>
-            <w:pPr>
-              <w:jc w:val="center"/>
-              <w:rPr>
-                <w:b/>
-                <w:bCs/>
-                <w:sz w:val="24"/>
-                <w:szCs w:val="24"/>
-                <w:lang w:val="lt-LT"/>
-              </w:rPr>
-            </w:pPr>
-            <w:r>
-              <w:rPr>
-                <w:b/>
-                <w:bCs/>
-                <w:sz w:val="24"/>
-                <w:szCs w:val="24"/>
-                <w:lang w:val="lt-LT"/>
-              </w:rPr>
-              <w:t>Komponentas</w:t>
-            </w:r>
-          </w:p>
-        </w:tc>
-        <w:tc>
-          <w:tcPr>
-            <w:tcW w:w="1812" w:type="dxa"/>
-            <w:shd w:val="clear" w:color="auto" w:fill="92D050"/>
-          </w:tcPr>
-          <w:p>
-            <w:pPr>
-              <w:jc w:val="center"/>
-              <w:rPr>
-                <w:b/>
-                <w:bCs/>
-                <w:sz w:val="24"/>
-                <w:szCs w:val="24"/>
-                <w:lang w:val="ru-RU"/>
-              </w:rPr>
-            </w:pPr>
-            <w:r>
-              <w:rPr>
-                <w:b/>
-                <w:bCs/>
-                <w:sz w:val="24"/>
-                <w:szCs w:val="24"/>
-                <w:lang w:val="lt-LT"/>
-              </w:rPr>
-              <w:t>Testo aprašymas</w:t>
-            </w:r>
-          </w:p>
-        </w:tc>
-        <w:tc>
-          <w:tcPr>
-            <w:tcW w:w="1813" w:type="dxa"/>
-            <w:shd w:val="clear" w:color="auto" w:fill="92D050"/>
-          </w:tcPr>
-          <w:p>
-            <w:pPr>
-              <w:jc w:val="center"/>
-              <w:rPr>
-                <w:b/>
-                <w:bCs/>
-                <w:sz w:val="24"/>
-                <w:szCs w:val="24"/>
-                <w:lang w:val="lt-LT"/>
-              </w:rPr>
-            </w:pPr>
-            <w:r>
-              <w:rPr>
-                <w:b/>
-                <w:bCs/>
-                <w:sz w:val="24"/>
-                <w:szCs w:val="24"/>
-              </w:rPr>
-              <w:t>Rezultatas</w:t>
-            </w:r>
-          </w:p>
-        </w:tc>
-        <w:tc>
-          <w:tcPr>
-            <w:tcW w:w="1813" w:type="dxa"/>
-            <w:shd w:val="clear" w:color="auto" w:fill="92D050"/>
-          </w:tcPr>
-          <w:p>
-            <w:pPr>
-              <w:jc w:val="center"/>
-              <w:rPr>
-                <w:b/>
-                <w:bCs/>
-                <w:sz w:val="24"/>
-                <w:szCs w:val="24"/>
-                <w:lang w:val="lt-LT"/>
-              </w:rPr>
-            </w:pPr>
-            <w:r>
-              <w:rPr>
-                <w:b/>
-                <w:bCs/>
-                <w:sz w:val="24"/>
-                <w:szCs w:val="24"/>
-              </w:rPr>
-              <w:t>Naudojami Mock'ai / Stub'ai</w:t>
-            </w:r>
-          </w:p>
-        </w:tc>
-      </w:tr>
-      <w:tr>
-        <w:tc>
-          <w:tcPr>
-            <w:tcW w:w="1812" w:type="dxa"/>
-          </w:tcPr>
-          <w:p>
-            <w:pPr>
-              <w:rPr>
-                <w:lang w:val="lt-LT"/>
-              </w:rPr>
-            </w:pPr>
-            <w:r>
-              <w:t>#</w:t>
-            </w:r>
-            <w:r>
-              <w:t>UNIFIT-</w:t>
-            </w:r>
-            <w:r>
-              <w:t>1</w:t>
-            </w:r>
-          </w:p>
-        </w:tc>
-        <w:tc>
-          <w:tcPr>
-            <w:tcW w:w="1812" w:type="dxa"/>
-          </w:tcPr>
-          <w:p>
-            <w:pPr>
-              <w:rPr>
-                <w:lang w:val="lt-LT"/>
-              </w:rPr>
-            </w:pPr>
-            <w:r>
-              <w:t>Login</w:t>
-            </w:r>
-          </w:p>
-        </w:tc>
-        <w:tc>
-          <w:tcPr>
-            <w:tcW w:w="1812" w:type="dxa"/>
-          </w:tcPr>
-          <w:p>
-            <w:pPr>
-              <w:rPr>
-                <w:lang w:val="ru-RU"/>
-              </w:rPr>
-            </w:pPr>
-            <w:r>
-              <w:t>Ekrano elementų atvaizdavimas</w:t>
-            </w:r>
-          </w:p>
-        </w:tc>
-        <w:tc>
-          <w:tcPr>
-            <w:tcW w:w="1813" w:type="dxa"/>
-          </w:tcPr>
-          <w:p>
-            <w:pPr>
-              <w:rPr>
-                <w:lang w:val="lt-LT"/>
-              </w:rPr>
-            </w:pPr>
-            <w:r>
-              <w:t>Elementai atvaizduojami</w:t>
-            </w:r>
-          </w:p>
-        </w:tc>
-        <w:tc>
-          <w:tcPr>
-            <w:tcW w:w="1813" w:type="dxa"/>
-          </w:tcPr>
-          <w:p>
-            <w:pPr>
-              <w:rPr>
-                <w:lang w:val="lt-LT"/>
-              </w:rPr>
-            </w:pPr>
-            <w:r>
-              <w:t>mockNavigate: navigacijos funkcijos iškvietimas</w:t>
-            </w:r>
-          </w:p>
-        </w:tc>
-      </w:tr>
-      <w:tr>
-        <w:tc>
-          <w:tcPr>
-            <w:tcW w:w="1812" w:type="dxa"/>
-          </w:tcPr>
-          <w:p>
-            <w:pPr>
-              <w:rPr>
-                <w:lang w:val="lt-LT"/>
-              </w:rPr>
-            </w:pPr>
-            <w:r>
-              <w:rPr>
-                <w:lang w:val="lt-LT"/>
-              </w:rPr>
-              <w:t>#</w:t>
-            </w:r>
-            <w:r>
-              <w:rPr>
-                <w:lang w:val="lt-LT"/>
-              </w:rPr>
-              <w:t>UNIFIT-</w:t>
-            </w:r>
-            <w:r>
-              <w:rPr>
-                <w:lang w:val="lt-LT"/>
-              </w:rPr>
-              <w:t>2</w:t>
-            </w:r>
-          </w:p>
-        </w:tc>
-        <w:tc>
-          <w:tcPr>
-            <w:tcW w:w="1812" w:type="dxa"/>
-          </w:tcPr>
-          <w:p>
-            <w:pPr>
-              <w:rPr>
-                <w:lang w:val="lt-LT"/>
-              </w:rPr>
-            </w:pPr>
-            <w:r>
-              <w:t>Login</w:t>
-            </w:r>
-          </w:p>
-        </w:tc>
-        <w:tc>
-          <w:tcPr>
-            <w:tcW w:w="1812" w:type="dxa"/>
-          </w:tcPr>
-          <w:p>
-            <w:pPr>
-              <w:rPr>
-                <w:lang w:val="en-US"/>
-              </w:rPr>
-            </w:pPr>
-            <w:r>
-              <w:t>Laukų "Email" ir "Password" įvedimas</w:t>
-            </w:r>
-          </w:p>
-        </w:tc>
-        <w:tc>
-          <w:tcPr>
-            <w:tcW w:w="1813" w:type="dxa"/>
-          </w:tcPr>
-          <w:p>
-            <w:pPr>
-              <w:rPr>
-                <w:lang w:val="lt-LT"/>
-              </w:rPr>
-            </w:pPr>
-            <w:r>
-              <w:t>Laukai atnaujinami</w:t>
-            </w:r>
-          </w:p>
-        </w:tc>
-        <w:tc>
-          <w:tcPr>
-            <w:tcW w:w="1813" w:type="dxa"/>
-          </w:tcPr>
-          <w:p>
-            <w:pPr>
-              <w:rPr>
-                <w:lang w:val="lt-LT"/>
-              </w:rPr>
-            </w:pPr>
-            <w:r>
-              <w:t>fireEvent: changeText metodas, email = "user@example.com", password = "password123"</w:t>
-            </w:r>
-          </w:p>
-        </w:tc>
-      </w:tr>
-      <w:tr>
-        <w:tc>
-          <w:tcPr>
-            <w:tcW w:w="1812" w:type="dxa"/>
-          </w:tcPr>
-          <w:p>
-            <w:pPr>
-              <w:rPr>
-                <w:lang w:val="lt-LT"/>
-              </w:rPr>
-            </w:pPr>
-            <w:r>
-              <w:rPr>
-                <w:lang w:val="lt-LT"/>
-              </w:rPr>
-              <w:t>#</w:t>
-            </w:r>
-            <w:r>
-              <w:rPr>
-                <w:lang w:val="lt-LT"/>
-              </w:rPr>
-              <w:t>UNIFIT-</w:t>
-            </w:r>
-            <w:r>
-              <w:rPr>
-                <w:lang w:val="lt-LT"/>
-              </w:rPr>
-              <w:t>3</w:t>
-            </w:r>
-          </w:p>
-        </w:tc>
-        <w:tc>
-          <w:tcPr>
-            <w:tcW w:w="1812" w:type="dxa"/>
-          </w:tcPr>
-          <w:p>
-            <w:pPr>
-              <w:rPr>
-                <w:lang w:val="lt-LT"/>
-              </w:rPr>
-            </w:pPr>
-            <w:r>
-              <w:t>Register</w:t>
-            </w:r>
-          </w:p>
-        </w:tc>
-        <w:tc>
-          <w:tcPr>
-            <w:tcW w:w="1812" w:type="dxa"/>
-          </w:tcPr>
-          <w:p>
-            <w:pPr>
-              <w:rPr>
-                <w:lang w:val="ru-RU"/>
-              </w:rPr>
-            </w:pPr>
-            <w:r>
-              <w:t>Registracijos formos atvaizdavimas</w:t>
-            </w:r>
-          </w:p>
-        </w:tc>
-        <w:tc>
-          <w:tcPr>
-            <w:tcW w:w="1813" w:type="dxa"/>
-          </w:tcPr>
-          <w:p>
-            <w:pPr>
-              <w:rPr>
-                <w:lang w:val="lt-LT"/>
-              </w:rPr>
-            </w:pPr>
-            <w:r>
-              <w:t>Forma atvaizduojama</w:t>
-            </w:r>
-          </w:p>
-        </w:tc>
-        <w:tc>
-          <w:tcPr>
-            <w:tcW w:w="1813" w:type="dxa"/>
-          </w:tcPr>
-          <w:p>
-            <w:pPr>
-              <w:rPr>
-                <w:lang w:val="lt-LT"/>
-              </w:rPr>
-            </w:pPr>
-            <w:r>
-              <w:t>mockNavigation: navigacijos funkcija</w:t>
-            </w:r>
-          </w:p>
-        </w:tc>
-      </w:tr>
-      <w:tr>
-        <w:tc>
-          <w:tcPr>
-            <w:tcW w:w="1812" w:type="dxa"/>
-          </w:tcPr>
-          <w:p>
-            <w:pPr>
-              <w:rPr>
-                <w:lang w:val="lt-LT"/>
-              </w:rPr>
-            </w:pPr>
-            <w:r>
-              <w:rPr>
-                <w:lang w:val="lt-LT"/>
-              </w:rPr>
-              <w:t>#</w:t>
-            </w:r>
-            <w:r>
-              <w:rPr>
-                <w:lang w:val="lt-LT"/>
-              </w:rPr>
-              <w:t>UNIFIT-</w:t>
-            </w:r>
-            <w:r>
-              <w:rPr>
-                <w:lang w:val="lt-LT"/>
-              </w:rPr>
-              <w:t>4</w:t>
-            </w:r>
-          </w:p>
-        </w:tc>
-        <w:tc>
-          <w:tcPr>
-            <w:tcW w:w="1812" w:type="dxa"/>
-          </w:tcPr>
-          <w:p>
-            <w:pPr>
-              <w:rPr>
-                <w:lang w:val="lt-LT"/>
-              </w:rPr>
-            </w:pPr>
-            <w:r>
-              <w:t>Register</w:t>
-            </w:r>
-          </w:p>
-        </w:tc>
-        <w:tc>
-          <w:tcPr>
-            <w:tcW w:w="1812" w:type="dxa"/>
-          </w:tcPr>
-          <w:p>
-            <w:pPr>
-              <w:rPr>
-                <w:lang w:val="en-US"/>
-              </w:rPr>
-            </w:pPr>
-            <w:r>
-              <w:t>Laukų "Email" ir "Password" įvedimas</w:t>
-            </w:r>
-          </w:p>
-        </w:tc>
-        <w:tc>
-          <w:tcPr>
-            <w:tcW w:w="1813" w:type="dxa"/>
-          </w:tcPr>
-          <w:p>
-            <w:pPr>
-              <w:rPr>
-                <w:lang w:val="lt-LT"/>
-              </w:rPr>
-            </w:pPr>
-            <w:r>
-              <w:t>Laukai atnaujinami</w:t>
-            </w:r>
-          </w:p>
-        </w:tc>
-        <w:tc>
-          <w:tcPr>
-            <w:tcW w:w="1813" w:type="dxa"/>
-          </w:tcPr>
-          <w:p>
-            <w:pPr>
-              <w:rPr>
-                <w:lang w:val="lt-LT"/>
-              </w:rPr>
-            </w:pPr>
-            <w:r>
-              <w:t>fireEvent: changeText metodas, email = "newuser@example.com", password = "newpassword456"</w:t>
-            </w:r>
-          </w:p>
-        </w:tc>
-      </w:tr>
-      <w:tr>
-        <w:tc>
-          <w:tcPr>
-            <w:tcW w:w="1812" w:type="dxa"/>
-          </w:tcPr>
-          <w:p>
-            <w:pPr>
-              <w:rPr>
-                <w:lang w:val="lt-LT"/>
-              </w:rPr>
-            </w:pPr>
-            <w:r>
-              <w:rPr>
-                <w:lang w:val="lt-LT"/>
-              </w:rPr>
-              <w:t>#</w:t>
-            </w:r>
-            <w:r>
-              <w:rPr>
-                <w:lang w:val="lt-LT"/>
-              </w:rPr>
-              <w:t>UNIFIT-</w:t>
-            </w:r>
-            <w:r>
-              <w:rPr>
-                <w:lang w:val="lt-LT"/>
-              </w:rPr>
-              <w:t>5</w:t>
-            </w:r>
-          </w:p>
-        </w:tc>
-        <w:tc>
-          <w:tcPr>
-            <w:tcW w:w="1812" w:type="dxa"/>
-          </w:tcPr>
-          <w:p>
-            <w:pPr>
-              <w:rPr>
-                <w:lang w:val="lt-LT"/>
-              </w:rPr>
-            </w:pPr>
-            <w:r>
-              <w:t>Register</w:t>
-            </w:r>
-          </w:p>
-        </w:tc>
-        <w:tc>
-          <w:tcPr>
-            <w:tcW w:w="1812" w:type="dxa"/>
-          </w:tcPr>
-          <w:p>
-            <w:pPr>
-              <w:rPr>
-                <w:lang w:val="ru-RU"/>
-              </w:rPr>
-            </w:pPr>
-            <w:r>
-              <w:t>Registracijos sėkmės tvarkymas</w:t>
-            </w:r>
-          </w:p>
-        </w:tc>
-        <w:tc>
-          <w:tcPr>
-            <w:tcW w:w="1813" w:type="dxa"/>
-          </w:tcPr>
-          <w:p>
-            <w:pPr>
-              <w:rPr>
-                <w:lang w:val="lt-LT"/>
-              </w:rPr>
-            </w:pPr>
-            <w:r>
-              <w:t>Nukreipiama į prisijungimo ekraną</w:t>
-            </w:r>
-          </w:p>
-        </w:tc>
-        <w:tc>
-          <w:tcPr>
-            <w:tcW w:w="1813" w:type="dxa"/>
-          </w:tcPr>
-          <w:p>
-            <w:pPr>
-              <w:rPr>
-                <w:lang w:val="lt-LT"/>
-              </w:rPr>
-            </w:pPr>
-            <w:r>
-              <w:t>mockAuth.signUp: registracijos funkcijos resolve su user = { uid: "123", email: "newuser@example.com" }</w:t>
-            </w:r>
-          </w:p>
-        </w:tc>
-      </w:tr>
-      <w:tr>
-        <w:tc>
-          <w:tcPr>
-            <w:tcW w:w="1812" w:type="dxa"/>
-          </w:tcPr>
-          <w:p>
-            <w:pPr>
-              <w:rPr>
-                <w:lang w:val="lt-LT"/>
-              </w:rPr>
-            </w:pPr>
-            <w:r>
-              <w:rPr>
-                <w:lang w:val="lt-LT"/>
-              </w:rPr>
-              <w:t>#</w:t>
-            </w:r>
-            <w:r>
-              <w:rPr>
-                <w:lang w:val="lt-LT"/>
-              </w:rPr>
-              <w:t>UNIFIT-</w:t>
-            </w:r>
-            <w:r>
-              <w:rPr>
-                <w:lang w:val="lt-LT"/>
-              </w:rPr>
-              <w:t>6</w:t>
-            </w:r>
-          </w:p>
-        </w:tc>
-        <w:tc>
-          <w:tcPr>
-            <w:tcW w:w="1812" w:type="dxa"/>
-          </w:tcPr>
-          <w:p>
-            <w:pPr>
-              <w:rPr>
-                <w:lang w:val="lt-LT"/>
-              </w:rPr>
-            </w:pPr>
-            <w:r>
-              <w:t>Register</w:t>
-            </w:r>
-          </w:p>
-        </w:tc>
-        <w:tc>
-          <w:tcPr>
-            <w:tcW w:w="1812" w:type="dxa"/>
-          </w:tcPr>
-          <w:tbl>
-            <w:tblPr>
-              <w:tblW w:w="0" w:type="auto"/>
-              <w:tblCellSpacing w:w="15" w:type="dxa"/>
-              <w:tblCellMar>
-                <w:top w:w="15" w:type="dxa"/>
-                <w:left w:w="15" w:type="dxa"/>
-                <w:bottom w:w="15" w:type="dxa"/>
-                <w:right w:w="15" w:type="dxa"/>
-              </w:tblCellMar>
-              <w:tblLook w:val="04A0" w:firstRow="1" w:lastRow="0" w:firstColumn="1" w:lastColumn="0" w:noHBand="0" w:noVBand="1"/>
-            </w:tblPr>
-            <w:tblGrid>
-              <w:gridCol w:w="96"/>
-            </w:tblGrid>
-            <w:tr>
-              <w:trPr>
-                <w:tblCellSpacing w:w="15" w:type="dxa"/>
-              </w:trPr>
-              <w:tc>
-                <w:tcPr>
-                  <w:tcW w:w="0" w:type="auto"/>
-                  <w:vAlign w:val="center"/>
-                  <w:hideMark/>
-                </w:tcPr>
-                <w:p>
-                  <w:pPr>
-                    <w:spacing w:after="0" w:line="240" w:lineRule="auto"/>
-                    <w:rPr>
-                      <w:lang w:val="lt-LT"/>
-                    </w:rPr>
-                  </w:pPr>
-                </w:p>
-              </w:tc>
-            </w:tr>
-          </w:tbl>
-          <w:p>
-            <w:pPr>
-              <w:rPr>
-                <w:vanish/>
-                <w:lang w:val="lt-LT"/>
-              </w:rPr>
-            </w:pPr>
-          </w:p>
-          <w:tbl>
-            <w:tblPr>
-              <w:tblW w:w="0" w:type="auto"/>
-              <w:tblCellSpacing w:w="15" w:type="dxa"/>
-              <w:tblCellMar>
-                <w:top w:w="15" w:type="dxa"/>
-                <w:left w:w="15" w:type="dxa"/>
-                <w:bottom w:w="15" w:type="dxa"/>
-                <w:right w:w="15" w:type="dxa"/>
-              </w:tblCellMar>
-              <w:tblLook w:val="04A0" w:firstRow="1" w:lastRow="0" w:firstColumn="1" w:lastColumn="0" w:noHBand="0" w:noVBand="1"/>
-            </w:tblPr>
-            <w:tblGrid>
-              <w:gridCol w:w="1452"/>
-            </w:tblGrid>
-            <w:tr>
-              <w:trPr>
-                <w:tblCellSpacing w:w="15" w:type="dxa"/>
-              </w:trPr>
-              <w:tc>
-                <w:tcPr>
-                  <w:tcW w:w="0" w:type="auto"/>
-                  <w:vAlign w:val="center"/>
-                  <w:hideMark/>
-                </w:tcPr>
-                <w:p>
-                  <w:pPr>
-                    <w:spacing w:after="0" w:line="240" w:lineRule="auto"/>
-                    <w:rPr>
-                      <w:lang w:val="lt-LT"/>
-                    </w:rPr>
-                  </w:pPr>
-                  <w:r>
-                    <w:rPr>
-                      <w:lang w:val="lt-LT"/>
-                    </w:rPr>
-                    <w:t>Klaidos pranešimo atvaizdavimas</w:t>
-                  </w:r>
-                </w:p>
-              </w:tc>
-            </w:tr>
-          </w:tbl>
-          <w:p>
-            <w:pPr>
-              <w:rPr>
-                <w:lang w:val="en-US"/>
-              </w:rPr>
-            </w:pPr>
-          </w:p>
-        </w:tc>
-        <w:tc>
-          <w:tcPr>
-            <w:tcW w:w="1813" w:type="dxa"/>
-          </w:tcPr>
-          <w:p>
-            <w:pPr>
-              <w:rPr>
-                <w:lang w:val="lt-LT"/>
-              </w:rPr>
-            </w:pPr>
-            <w:r>
-              <w:t>Rodoma klaida</w:t>
-            </w:r>
-          </w:p>
-        </w:tc>
-        <w:tc>
-          <w:tcPr>
-            <w:tcW w:w="1813" w:type="dxa"/>
-          </w:tcPr>
-          <w:p>
-            <w:pPr>
-              <w:rPr>
-                <w:lang w:val="lt-LT"/>
-              </w:rPr>
-            </w:pPr>
-            <w:r>
-              <w:t>mockAuth.signUp: registracijos funkcijos reject su klaida auth/email-already-in-use</w:t>
-            </w:r>
-          </w:p>
-        </w:tc>
-      </w:tr>
-      <w:tr>
-        <w:tc>
-          <w:tcPr>
-            <w:tcW w:w="1812" w:type="dxa"/>
-          </w:tcPr>
-          <w:p>
-            <w:pPr>
-              <w:rPr>
-                <w:lang w:val="lt-LT"/>
-              </w:rPr>
-            </w:pPr>
-            <w:r>
-              <w:rPr>
-                <w:lang w:val="lt-LT"/>
-              </w:rPr>
-              <w:t>#</w:t>
-            </w:r>
-            <w:r>
-              <w:rPr>
-                <w:lang w:val="lt-LT"/>
-              </w:rPr>
-              <w:t>UNIFIT-</w:t>
-            </w:r>
-            <w:r>
-              <w:rPr>
-                <w:lang w:val="lt-LT"/>
-              </w:rPr>
-              <w:t>7</w:t>
-            </w:r>
-          </w:p>
-        </w:tc>
-        <w:tc>
-          <w:tcPr>
-            <w:tcW w:w="1812" w:type="dxa"/>
-          </w:tcPr>
-          <w:p>
-            <w:pPr>
-              <w:rPr>
-                <w:lang w:val="lt-LT"/>
-              </w:rPr>
-            </w:pPr>
-            <w:r>
-              <w:t>Register</w:t>
-            </w:r>
-          </w:p>
-        </w:tc>
-        <w:tc>
-          <w:tcPr>
-            <w:tcW w:w="1812" w:type="dxa"/>
-          </w:tcPr>
-          <w:p>
-            <w:pPr>
-              <w:rPr>
-                <w:lang w:val="ru-RU"/>
-              </w:rPr>
-            </w:pPr>
-            <w:r>
-              <w:t>Prisijungimo ekrano atidarymas</w:t>
-            </w:r>
-          </w:p>
-        </w:tc>
-        <w:tc>
-          <w:tcPr>
-            <w:tcW w:w="1813" w:type="dxa"/>
-          </w:tcPr>
-          <w:p>
-            <w:pPr>
-              <w:rPr>
-                <w:lang w:val="lt-LT"/>
-              </w:rPr>
-            </w:pPr>
-            <w:r>
-              <w:t>Nukreipiama į prisijungimo ekraną</w:t>
-            </w:r>
-          </w:p>
-        </w:tc>
-        <w:tc>
-          <w:tcPr>
-            <w:tcW w:w="1813" w:type="dxa"/>
-          </w:tcPr>
-          <w:p>
-            <w:pPr>
-              <w:rPr>
-                <w:lang w:val="lt-LT"/>
-              </w:rPr>
-            </w:pPr>
-            <w:r>
-              <w:t>fireEvent: navigacija naudojant mockNavigation</w:t>
-            </w:r>
-          </w:p>
-        </w:tc>
-      </w:tr>
-      <w:tr>
-        <w:tc>
-          <w:tcPr>
-            <w:tcW w:w="1812" w:type="dxa"/>
-          </w:tcPr>
-          <w:p>
-            <w:pPr>
-              <w:rPr>
-                <w:lang w:val="lt-LT"/>
-              </w:rPr>
-            </w:pPr>
-            <w:r>
-              <w:rPr>
-                <w:lang w:val="lt-LT"/>
-              </w:rPr>
-              <w:t>#</w:t>
-            </w:r>
-            <w:r>
-              <w:rPr>
-                <w:lang w:val="lt-LT"/>
-              </w:rPr>
-              <w:t>UNIFIT-</w:t>
-            </w:r>
-            <w:r>
-              <w:rPr>
-                <w:lang w:val="lt-LT"/>
-              </w:rPr>
-              <w:t>8</w:t>
-            </w:r>
-          </w:p>
-        </w:tc>
-        <w:tc>
-          <w:tcPr>
-            <w:tcW w:w="1812" w:type="dxa"/>
-          </w:tcPr>
-          <w:p>
-            <w:pPr>
-              <w:rPr>
-                <w:lang w:val="lt-LT"/>
-              </w:rPr>
-            </w:pPr>
-            <w:proofErr w:type="spellStart"/>
-            <w:r>
-              <w:rPr>
-                <w:lang w:val="lt-LT"/>
-              </w:rPr>
-              <w:t>ForgotPassword</w:t>
-            </w:r>
-            <w:proofErr w:type="spellEnd"/>
-          </w:p>
-        </w:tc>
-        <w:tc>
-          <w:tcPr>
-            <w:tcW w:w="1812" w:type="dxa"/>
-          </w:tcPr>
-          <w:p>
-            <w:pPr>
-              <w:rPr>
-                <w:lang w:val="ru-RU"/>
-              </w:rPr>
-            </w:pPr>
-            <w:r>
-              <w:t>Ekrano elementų atvaizdavimas</w:t>
-            </w:r>
-          </w:p>
-        </w:tc>
-        <w:tc>
-          <w:tcPr>
-            <w:tcW w:w="1813" w:type="dxa"/>
-          </w:tcPr>
-          <w:p>
-            <w:pPr>
-              <w:rPr>
-                <w:lang w:val="lt-LT"/>
-              </w:rPr>
-            </w:pPr>
-            <w:r>
-              <w:t>Elementai atvaizduojami</w:t>
-            </w:r>
-          </w:p>
-        </w:tc>
-        <w:tc>
-          <w:tcPr>
-            <w:tcW w:w="1813" w:type="dxa"/>
-          </w:tcPr>
-          <w:p>
-            <w:pPr>
-              <w:rPr>
-                <w:lang w:val="lt-LT"/>
-              </w:rPr>
-            </w:pPr>
-            <w:r>
-              <w:t>mockNavigation: navigacijos funkcijos iškvietimas</w:t>
-            </w:r>
-          </w:p>
-        </w:tc>
-      </w:tr>
-      <w:tr>
-        <w:tc>
-          <w:tcPr>
-            <w:tcW w:w="1812" w:type="dxa"/>
-          </w:tcPr>
-          <w:p>
-            <w:pPr>
-              <w:rPr>
-                <w:lang w:val="lt-LT"/>
-              </w:rPr>
-            </w:pPr>
-            <w:r>
-              <w:rPr>
-                <w:lang w:val="lt-LT"/>
-              </w:rPr>
-              <w:t>#</w:t>
-            </w:r>
-            <w:r>
-              <w:rPr>
-                <w:lang w:val="lt-LT"/>
-              </w:rPr>
-              <w:t>UNIFIT-</w:t>
-            </w:r>
-            <w:r>
-              <w:rPr>
-                <w:lang w:val="lt-LT"/>
-              </w:rPr>
-              <w:t>9</w:t>
-            </w:r>
-          </w:p>
-        </w:tc>
-        <w:tc>
-          <w:tcPr>
-            <w:tcW w:w="1812" w:type="dxa"/>
-          </w:tcPr>
-          <w:p>
-            <w:pPr>
-              <w:rPr>
-                <w:lang w:val="lt-LT"/>
-              </w:rPr>
-            </w:pPr>
-            <w:proofErr w:type="spellStart"/>
-            <w:r>
-              <w:rPr>
-                <w:lang w:val="lt-LT"/>
-              </w:rPr>
-              <w:t>ForgotPassword</w:t>
-            </w:r>
-            <w:proofErr w:type="spellEnd"/>
-          </w:p>
-        </w:tc>
-        <w:tc>
-          <w:tcPr>
-            <w:tcW w:w="1812" w:type="dxa"/>
-          </w:tcPr>
-          <w:p>
-            <w:pPr>
-              <w:rPr>
-                <w:lang w:val="en-US"/>
-              </w:rPr>
-            </w:pPr>
-            <w:r>
-              <w:t>Tuščio el. pašto laukelio perspėjimas</w:t>
-            </w:r>
-          </w:p>
-        </w:tc>
-        <w:tc>
-          <w:tcPr>
-            <w:tcW w:w="1813" w:type="dxa"/>
-          </w:tcPr>
-          <w:p>
-            <w:pPr>
-              <w:rPr>
-                <w:lang w:val="lt-LT"/>
-              </w:rPr>
-            </w:pPr>
-            <w:r>
-              <w:t>Rodomas perspėjimas</w:t>
-            </w:r>
-          </w:p>
-        </w:tc>
-        <w:tc>
-          <w:tcPr>
-            <w:tcW w:w="1813" w:type="dxa"/>
-          </w:tcPr>
-          <w:p>
-            <w:pPr>
-              <w:rPr>
-                <w:lang w:val="lt-LT"/>
-              </w:rPr>
-            </w:pPr>
-            <w:r>
-              <w:t>alertSpy: tuščio lauko perspėjimo alert funkcija, email = ""</w:t>
-            </w:r>
-          </w:p>
-        </w:tc>
-      </w:tr>
-      <w:tr>
-        <w:tc>
-          <w:tcPr>
-            <w:tcW w:w="1812" w:type="dxa"/>
-          </w:tcPr>
-          <w:p>
-            <w:pPr>
-              <w:rPr>
-                <w:lang w:val="lt-LT"/>
-              </w:rPr>
-            </w:pPr>
-            <w:r>
-              <w:rPr>
-                <w:lang w:val="lt-LT"/>
-              </w:rPr>
-              <w:t>#</w:t>
-            </w:r>
-            <w:r>
-              <w:rPr>
-                <w:lang w:val="lt-LT"/>
-              </w:rPr>
-              <w:t>UNIFIT-</w:t>
-            </w:r>
-            <w:r>
-              <w:rPr>
-                <w:lang w:val="lt-LT"/>
-              </w:rPr>
-              <w:t>10</w:t>
-            </w:r>
-          </w:p>
-        </w:tc>
-        <w:tc>
-          <w:tcPr>
-            <w:tcW w:w="1812" w:type="dxa"/>
-          </w:tcPr>
-          <w:p>
-            <w:pPr>
-              <w:rPr>
-                <w:lang w:val="lt-LT"/>
-              </w:rPr>
-            </w:pPr>
-            <w:proofErr w:type="spellStart"/>
-            <w:r>
-              <w:rPr>
-                <w:lang w:val="lt-LT"/>
-              </w:rPr>
-              <w:t>ForgotPassword</w:t>
-            </w:r>
-            <w:proofErr w:type="spellEnd"/>
-          </w:p>
-        </w:tc>
-        <w:tc>
-          <w:tcPr>
-            <w:tcW w:w="1812" w:type="dxa"/>
-          </w:tcPr>
-          <w:p>
-            <w:pPr>
-              <w:rPr>
-                <w:lang w:val="ru-RU"/>
-              </w:rPr>
-            </w:pPr>
-            <w:r>
-              <w:t>Sėkmingas slaptažodžio atkūrimas</w:t>
-            </w:r>
-          </w:p>
-        </w:tc>
-        <w:tc>
-          <w:tcPr>
-            <w:tcW w:w="1813" w:type="dxa"/>
-          </w:tcPr>
-          <w:p>
-            <w:pPr>
-              <w:rPr>
-                <w:lang w:val="lt-LT"/>
-              </w:rPr>
-            </w:pPr>
-            <w:r>
-              <w:t>Nukreipiama į prisijungimo ekraną</w:t>
-            </w:r>
-          </w:p>
-        </w:tc>
-        <w:tc>
-          <w:tcPr>
-            <w:tcW w:w="1813" w:type="dxa"/>
-          </w:tcPr>
-          <w:p>
-            <w:pPr>
-              <w:rPr>
-                <w:lang w:val="lt-LT"/>
-              </w:rPr>
-            </w:pPr>
-            <w:r>
-              <w:t>sendPasswordResetEmail: sėkmingas resolve su email = "user@example.com"</w:t>
-            </w:r>
-          </w:p>
-        </w:tc>
-      </w:tr>
-      <w:tr>
-        <w:tc>
-          <w:tcPr>
-            <w:tcW w:w="1812" w:type="dxa"/>
-          </w:tcPr>
-          <w:p>
-            <w:pPr>
-              <w:rPr>
-                <w:lang w:val="lt-LT"/>
-              </w:rPr>
-            </w:pPr>
-            <w:r>
-              <w:rPr>
-                <w:lang w:val="lt-LT"/>
-              </w:rPr>
-              <w:t>#</w:t>
-            </w:r>
-            <w:r>
-              <w:rPr>
-                <w:lang w:val="lt-LT"/>
-              </w:rPr>
-              <w:t>UNIFIT-</w:t>
-            </w:r>
-            <w:r>
-              <w:rPr>
-                <w:lang w:val="lt-LT"/>
-              </w:rPr>
-              <w:t>11</w:t>
-            </w:r>
-          </w:p>
-        </w:tc>
-        <w:tc>
-          <w:tcPr>
-            <w:tcW w:w="1812" w:type="dxa"/>
-          </w:tcPr>
-          <w:p>
-            <w:pPr>
-              <w:rPr>
-                <w:lang w:val="lt-LT"/>
-              </w:rPr>
-            </w:pPr>
-            <w:proofErr w:type="spellStart"/>
-            <w:r>
-              <w:rPr>
-                <w:lang w:val="lt-LT"/>
-              </w:rPr>
-              <w:t>ForgotPassword</w:t>
-            </w:r>
-            <w:proofErr w:type="spellEnd"/>
-          </w:p>
-        </w:tc>
-        <w:tc>
-          <w:tcPr>
-            <w:tcW w:w="1812" w:type="dxa"/>
-          </w:tcPr>
-          <w:p>
-            <w:pPr>
-              <w:rPr>
-                <w:lang w:val="ru-RU"/>
-              </w:rPr>
-            </w:pPr>
-            <w:r>
-              <w:t>Neteisingo el. pašto klaida</w:t>
-            </w:r>
-          </w:p>
-        </w:tc>
-        <w:tc>
-          <w:tcPr>
-            <w:tcW w:w="1813" w:type="dxa"/>
-          </w:tcPr>
-          <w:p>
-            <w:pPr>
-              <w:rPr>
-                <w:lang w:val="lt-LT"/>
-              </w:rPr>
-            </w:pPr>
-            <w:r>
-              <w:t>Rodomas perspėjimas</w:t>
-            </w:r>
-          </w:p>
-        </w:tc>
-        <w:tc>
-          <w:tcPr>
-            <w:tcW w:w="1813" w:type="dxa"/>
-          </w:tcPr>
-          <w:p>
-            <w:pPr>
-              <w:rPr>
-                <w:lang w:val="lt-LT"/>
-              </w:rPr>
-            </w:pPr>
-            <w:r>
-              <w:t>sendPasswordResetEmail: klaidos auth/invalid-email</w:t>
-            </w:r>
-          </w:p>
-        </w:tc>
-      </w:tr>
-      <w:tr>
-        <w:tc>
-          <w:tcPr>
-            <w:tcW w:w="1812" w:type="dxa"/>
-          </w:tcPr>
-          <w:p>
-            <w:pPr>
-              <w:rPr>
-                <w:lang w:val="lt-LT"/>
-              </w:rPr>
-            </w:pPr>
-            <w:r>
-              <w:rPr>
-                <w:lang w:val="lt-LT"/>
-              </w:rPr>
-              <w:lastRenderedPageBreak/>
-              <w:t>#</w:t>
-            </w:r>
-            <w:r>
-              <w:rPr>
-                <w:lang w:val="lt-LT"/>
-              </w:rPr>
-              <w:t>UNIFIT-</w:t>
-            </w:r>
-            <w:r>
-              <w:rPr>
-                <w:lang w:val="lt-LT"/>
-              </w:rPr>
-              <w:t>12</w:t>
-            </w:r>
-          </w:p>
-        </w:tc>
-        <w:tc>
-          <w:tcPr>
-            <w:tcW w:w="1812" w:type="dxa"/>
-          </w:tcPr>
-          <w:p>
-            <w:pPr>
-              <w:rPr>
-                <w:lang w:val="lt-LT"/>
-              </w:rPr>
-            </w:pPr>
-            <w:proofErr w:type="spellStart"/>
-            <w:r>
-              <w:rPr>
-                <w:lang w:val="lt-LT"/>
-              </w:rPr>
-              <w:t>ForgotPassword</w:t>
-            </w:r>
-            <w:proofErr w:type="spellEnd"/>
-          </w:p>
-        </w:tc>
-        <w:tc>
-          <w:tcPr>
-            <w:tcW w:w="1812" w:type="dxa"/>
-          </w:tcPr>
-          <w:p>
-            <w:pPr>
-              <w:rPr>
-                <w:lang w:val="ru-RU"/>
-              </w:rPr>
-            </w:pPr>
-            <w:r>
-              <w:t>Nerasto vartotojo perspėjimas</w:t>
-            </w:r>
-          </w:p>
-        </w:tc>
-        <w:tc>
-          <w:tcPr>
-            <w:tcW w:w="1813" w:type="dxa"/>
-          </w:tcPr>
-          <w:p>
-            <w:pPr>
-              <w:rPr>
-                <w:lang w:val="lt-LT"/>
-              </w:rPr>
-            </w:pPr>
-            <w:r>
-              <w:t>Rodomas perspėjimas</w:t>
-            </w:r>
-          </w:p>
-        </w:tc>
-        <w:tc>
-          <w:tcPr>
-            <w:tcW w:w="1813" w:type="dxa"/>
-          </w:tcPr>
-          <w:p>
-            <w:pPr>
-              <w:rPr>
-                <w:vanish/>
-                <w:lang w:val="lt-LT"/>
-              </w:rPr>
-            </w:pPr>
-          </w:p>
-          <w:tbl>
-            <w:tblPr>
-              <w:tblW w:w="0" w:type="auto"/>
-              <w:tblCellSpacing w:w="15" w:type="dxa"/>
-              <w:tblCellMar>
-                <w:top w:w="15" w:type="dxa"/>
-                <w:left w:w="15" w:type="dxa"/>
-                <w:bottom w:w="15" w:type="dxa"/>
-                <w:right w:w="15" w:type="dxa"/>
-              </w:tblCellMar>
-              <w:tblLook w:val="04A0" w:firstRow="1" w:lastRow="0" w:firstColumn="1" w:lastColumn="0" w:noHBand="0" w:noVBand="1"/>
-            </w:tblPr>
-            <w:tblGrid>
-              <w:gridCol w:w="2420"/>
-            </w:tblGrid>
-            <w:tr>
-              <w:trPr>
-                <w:tblCellSpacing w:w="15" w:type="dxa"/>
-              </w:trPr>
-              <w:tc>
-                <w:tcPr>
-                  <w:tcW w:w="0" w:type="auto"/>
-                  <w:vAlign w:val="center"/>
-                  <w:hideMark/>
-                </w:tcPr>
-                <w:p>
-                  <w:pPr>
-                    <w:spacing w:after="0" w:line="240" w:lineRule="auto"/>
-                    <w:rPr>
-                      <w:lang w:val="lt-LT"/>
-                    </w:rPr>
-                  </w:pPr>
-                  <w:proofErr w:type="spellStart"/>
-                  <w:r>
-                    <w:rPr>
-                      <w:lang w:val="lt-LT"/>
-                    </w:rPr>
-                    <w:t>sendPasswordResetEmail</w:t>
-                  </w:r>
-                  <w:proofErr w:type="spellEnd"/>
-                  <w:r>
-                    <w:rPr>
-                      <w:lang w:val="lt-LT"/>
-                    </w:rPr>
-                    <w:t xml:space="preserve">: klaidos </w:t>
-                  </w:r>
-                  <w:proofErr w:type="spellStart"/>
-                  <w:r>
-                    <w:rPr>
-                      <w:lang w:val="lt-LT"/>
-                    </w:rPr>
-                    <w:t>auth</w:t>
-                  </w:r>
-                  <w:proofErr w:type="spellEnd"/>
-                  <w:r>
-                    <w:rPr>
-                      <w:lang w:val="lt-LT"/>
-                    </w:rPr>
-                    <w:t>/user-</w:t>
-                  </w:r>
-                  <w:proofErr w:type="spellStart"/>
-                  <w:r>
-                    <w:rPr>
-                      <w:lang w:val="lt-LT"/>
-                    </w:rPr>
-                    <w:t>not</w:t>
-                  </w:r>
-                  <w:proofErr w:type="spellEnd"/>
-                  <w:r>
-                    <w:rPr>
-                      <w:lang w:val="lt-LT"/>
-                    </w:rPr>
-                    <w:t>-</w:t>
-                  </w:r>
-                  <w:proofErr w:type="spellStart"/>
-                  <w:r>
-                    <w:rPr>
-                      <w:lang w:val="lt-LT"/>
-                    </w:rPr>
-                    <w:t>found</w:t>
-                  </w:r>
-                  <w:proofErr w:type="spellEnd"/>
-                </w:p>
-              </w:tc>
-            </w:tr>
-          </w:tbl>
-          <w:p>
-            <w:pPr>
-              <w:rPr>
-                <w:lang w:val="lt-LT"/>
-              </w:rPr>
-            </w:pPr>
-          </w:p>
-        </w:tc>
-      </w:tr>
-      <w:tr>
-        <w:tc>
-          <w:tcPr>
-            <w:tcW w:w="1812" w:type="dxa"/>
-          </w:tcPr>
-          <w:p>
-            <w:pPr>
-              <w:rPr>
-                <w:lang w:val="lt-LT"/>
-              </w:rPr>
-            </w:pPr>
-            <w:r>
-              <w:t>#</w:t>
-            </w:r>
-            <w:r>
-              <w:rPr>
-                <w:lang w:val="lt-LT"/>
-              </w:rPr>
-              <w:t>UNIFIT-</w:t>
-            </w:r>
-            <w:r>
-              <w:t>13</w:t>
-            </w:r>
-          </w:p>
-        </w:tc>
-        <w:tc>
-          <w:tcPr>
-            <w:tcW w:w="1812" w:type="dxa"/>
-          </w:tcPr>
-          <w:p>
-            <w:pPr>
-              <w:rPr>
-                <w:lang w:val="lt-LT"/>
-              </w:rPr>
-            </w:pPr>
-            <w:proofErr w:type="spellStart"/>
-            <w:r>
-              <w:rPr>
-                <w:lang w:val="lt-LT"/>
-              </w:rPr>
-              <w:t>ForgotPassword</w:t>
-            </w:r>
-            <w:proofErr w:type="spellEnd"/>
-          </w:p>
-        </w:tc>
-        <w:tc>
-          <w:tcPr>
-            <w:tcW w:w="1812" w:type="dxa"/>
-          </w:tcPr>
-          <w:p>
-            <w:pPr>
-              <w:rPr>
-                <w:lang w:val="ru-RU"/>
-              </w:rPr>
-            </w:pPr>
-            <w:r>
-              <w:t>Kitos klaidos tvarkymas</w:t>
-            </w:r>
-          </w:p>
-        </w:tc>
-        <w:tc>
-          <w:tcPr>
-            <w:tcW w:w="1813" w:type="dxa"/>
-          </w:tcPr>
-          <w:p>
-            <w:pPr>
-              <w:rPr>
-                <w:lang w:val="lt-LT"/>
-              </w:rPr>
-            </w:pPr>
-            <w:r>
-              <w:t>Rodomas bendras perspėjimas</w:t>
-            </w:r>
-          </w:p>
-        </w:tc>
-        <w:tc>
-          <w:tcPr>
-            <w:tcW w:w="1813" w:type="dxa"/>
-          </w:tcPr>
-          <w:p>
-            <w:pPr>
-              <w:rPr>
-                <w:lang w:val="lt-LT"/>
-              </w:rPr>
-            </w:pPr>
-            <w:r>
-              <w:t>sendPasswordResetEmail: reject su bendrine klaida, email = "generic@example.com"</w:t>
-            </w:r>
-          </w:p>
-        </w:tc>
-      </w:tr>
-      <w:tr>
-        <w:tc>
-          <w:tcPr>
-            <w:tcW w:w="1812" w:type="dxa"/>
-          </w:tcPr>
-          <w:p>
-            <w:pPr>
-              <w:rPr>
-                <w:lang w:val="lt-LT"/>
-              </w:rPr>
-            </w:pPr>
-            <w:r>
-              <w:rPr>
-                <w:lang w:val="lt-LT"/>
-              </w:rPr>
-              <w:t>#</w:t>
-            </w:r>
-            <w:r>
-              <w:rPr>
-                <w:lang w:val="lt-LT"/>
-              </w:rPr>
-              <w:t>UNIFIT-</w:t>
-            </w:r>
-            <w:r>
-              <w:rPr>
-                <w:lang w:val="lt-LT"/>
-              </w:rPr>
-              <w:t>14</w:t>
-            </w:r>
-          </w:p>
-        </w:tc>
-        <w:tc>
-          <w:tcPr>
-            <w:tcW w:w="1812" w:type="dxa"/>
-          </w:tcPr>
-          <w:p>
-            <w:pPr>
-              <w:rPr>
-                <w:lang w:val="lt-LT"/>
-              </w:rPr>
-            </w:pPr>
-            <w:proofErr w:type="spellStart"/>
-            <w:r>
-              <w:rPr>
-                <w:lang w:val="lt-LT"/>
-              </w:rPr>
-              <w:t>Home</w:t>
-            </w:r>
-            <w:proofErr w:type="spellEnd"/>
-          </w:p>
-        </w:tc>
-        <w:tc>
-          <w:tcPr>
-            <w:tcW w:w="1812" w:type="dxa"/>
-          </w:tcPr>
-          <w:p>
-            <w:pPr>
-              <w:rPr>
-                <w:lang w:val="ru-RU"/>
-              </w:rPr>
-            </w:pPr>
-            <w:r>
-              <w:t>Ekrano elementų atvaizdavimas</w:t>
-            </w:r>
-          </w:p>
-        </w:tc>
-        <w:tc>
-          <w:tcPr>
-            <w:tcW w:w="1813" w:type="dxa"/>
-          </w:tcPr>
-          <w:p>
-            <w:pPr>
-              <w:rPr>
-                <w:lang w:val="lt-LT"/>
-              </w:rPr>
-            </w:pPr>
-            <w:r>
-              <w:t>Elementai atvaizduojami</w:t>
-            </w:r>
-          </w:p>
-        </w:tc>
-        <w:tc>
-          <w:tcPr>
-            <w:tcW w:w="1813" w:type="dxa"/>
-          </w:tcPr>
-          <w:p>
-            <w:pPr>
-              <w:rPr>
-                <w:lang w:val="lt-LT"/>
-              </w:rPr>
-            </w:pPr>
-            <w:r>
-              <w:t>mockNavigate: navigacijos funkcijos iškvietimas</w:t>
-            </w:r>
-          </w:p>
-        </w:tc>
-      </w:tr>
-      <w:tr>
-        <w:tc>
-          <w:tcPr>
-            <w:tcW w:w="1812" w:type="dxa"/>
-          </w:tcPr>
-          <w:p>
-            <w:pPr>
-              <w:rPr>
-                <w:lang w:val="lt-LT"/>
-              </w:rPr>
-            </w:pPr>
-            <w:r>
-              <w:rPr>
-                <w:lang w:val="lt-LT"/>
-              </w:rPr>
-              <w:t>#</w:t>
-            </w:r>
-            <w:r>
-              <w:rPr>
-                <w:lang w:val="lt-LT"/>
-              </w:rPr>
-              <w:t>UNIFIT-</w:t>
-            </w:r>
-            <w:r>
-              <w:rPr>
-                <w:lang w:val="lt-LT"/>
-              </w:rPr>
-              <w:t>15</w:t>
-            </w:r>
-          </w:p>
-        </w:tc>
-        <w:tc>
-          <w:tcPr>
-            <w:tcW w:w="1812" w:type="dxa"/>
-          </w:tcPr>
-          <w:p>
-            <w:pPr>
-              <w:rPr>
-                <w:lang w:val="lt-LT"/>
-              </w:rPr>
-            </w:pPr>
-            <w:proofErr w:type="spellStart"/>
-            <w:r>
-              <w:rPr>
-                <w:lang w:val="lt-LT"/>
-              </w:rPr>
-              <w:t>Map</w:t>
-            </w:r>
-            <w:proofErr w:type="spellEnd"/>
-          </w:p>
-        </w:tc>
-        <w:tc>
-          <w:tcPr>
-            <w:tcW w:w="1812" w:type="dxa"/>
-          </w:tcPr>
-          <w:p>
-            <w:pPr>
-              <w:rPr>
-                <w:lang w:val="ru-RU"/>
-              </w:rPr>
-            </w:pPr>
-            <w:r>
-              <w:t>Karštųjų zonų atvaizdavimas</w:t>
-            </w:r>
-          </w:p>
-        </w:tc>
-        <w:tc>
-          <w:tcPr>
-            <w:tcW w:w="1813" w:type="dxa"/>
-          </w:tcPr>
-          <w:p>
-            <w:pPr>
-              <w:rPr>
-                <w:lang w:val="ru-RU"/>
-              </w:rPr>
-            </w:pPr>
-            <w:r>
-              <w:rPr>
-                <w:lang w:val="lt-LT"/>
-              </w:rPr>
-              <w:t>Karštosios zonos atvaizduojamos</w:t>
-            </w:r>
-          </w:p>
-        </w:tc>
-        <w:tc>
-          <w:tcPr>
-            <w:tcW w:w="1813" w:type="dxa"/>
-          </w:tcPr>
-          <w:p>
-            <w:pPr>
-              <w:rPr>
-                <w:lang w:val="lt-LT"/>
-              </w:rPr>
-            </w:pPr>
-            <w:r>
-              <w:t>Firebase collection, getDocs: mockHotZonesData = [{ id: "zone1", name: "Zone 1" }]</w:t>
-            </w:r>
-          </w:p>
-        </w:tc>
-      </w:tr>
-      <w:tr>
-        <w:tc>
-          <w:tcPr>
-            <w:tcW w:w="1812" w:type="dxa"/>
-          </w:tcPr>
-          <w:p>
-            <w:pPr>
-              <w:rPr>
-                <w:lang w:val="en-US"/>
-              </w:rPr>
-            </w:pPr>
-            <w:r>
-              <w:rPr>
-                <w:lang w:val="en-US"/>
-              </w:rPr>
-              <w:t>#</w:t>
-            </w:r>
-            <w:r>
-              <w:rPr>
-                <w:lang w:val="lt-LT"/>
-              </w:rPr>
-              <w:t>UNIFIT-</w:t>
-            </w:r>
-            <w:r>
-              <w:rPr>
-                <w:lang w:val="en-US"/>
-              </w:rPr>
-              <w:t>16</w:t>
-            </w:r>
-          </w:p>
-        </w:tc>
-        <w:tc>
-          <w:tcPr>
-            <w:tcW w:w="1812" w:type="dxa"/>
-          </w:tcPr>
-          <w:p>
-            <w:pPr>
-              <w:rPr>
-                <w:lang w:val="lt-LT"/>
-              </w:rPr>
-            </w:pPr>
-            <w:proofErr w:type="spellStart"/>
-            <w:r>
-              <w:rPr>
-                <w:lang w:val="lt-LT"/>
-              </w:rPr>
-              <w:t>Missions</w:t>
-            </w:r>
-            <w:proofErr w:type="spellEnd"/>
-          </w:p>
-        </w:tc>
-        <w:tc>
-          <w:tcPr>
-            <w:tcW w:w="1812" w:type="dxa"/>
-          </w:tcPr>
-          <w:p>
-            <w:pPr>
-              <w:rPr>
-                <w:lang w:val="lt-LT"/>
-              </w:rPr>
-            </w:pPr>
-            <w:r>
-              <w:t>Turėtų rodyti misijas, kai jos sėkmingai įkeliamos.</w:t>
-            </w:r>
-          </w:p>
-        </w:tc>
-        <w:tc>
-          <w:tcPr>
-            <w:tcW w:w="1813" w:type="dxa"/>
-          </w:tcPr>
-          <w:p>
-            <w:pPr>
-              <w:rPr>
-                <w:lang w:val="lt-LT"/>
-              </w:rPr>
-            </w:pPr>
-            <w:r>
-              <w:t>Rodo misijų aprašymus "Mission 1", "Mission 2".</w:t>
-            </w:r>
-          </w:p>
-        </w:tc>
-        <w:tc>
-          <w:tcPr>
-            <w:tcW w:w="1813" w:type="dxa"/>
-          </w:tcPr>
-          <w:p>
-            <w:pPr>
-              <w:rPr>
-                <w:lang w:val="lt-LT"/>
-              </w:rPr>
-            </w:pPr>
-            <w:r>
-              <w:t>firebaseServices.getDocs: mockMissionsData = [{ id: "mission1", description: "Mission 1" }, { id: "mission2", description: "Mission 2" }]</w:t>
-            </w:r>
-          </w:p>
-        </w:tc>
-      </w:tr>
-      <w:tr>
-        <w:tc>
-          <w:tcPr>
-            <w:tcW w:w="1812" w:type="dxa"/>
-          </w:tcPr>
-          <w:p>
-            <w:pPr>
-              <w:rPr>
-                <w:lang w:val="lt-LT"/>
-              </w:rPr>
-            </w:pPr>
-            <w:r>
-              <w:rPr>
-                <w:lang w:val="lt-LT"/>
-              </w:rPr>
-              <w:t>#</w:t>
-            </w:r>
-            <w:r>
-              <w:rPr>
-                <w:lang w:val="lt-LT"/>
-              </w:rPr>
-              <w:t>UNIFIT-</w:t>
-            </w:r>
-            <w:r>
-              <w:rPr>
-                <w:lang w:val="lt-LT"/>
-              </w:rPr>
-              <w:t>17</w:t>
-            </w:r>
-          </w:p>
-        </w:tc>
-        <w:tc>
-          <w:tcPr>
-            <w:tcW w:w="1812" w:type="dxa"/>
-          </w:tcPr>
-          <w:p>
-            <w:pPr>
-              <w:rPr>
-                <w:lang w:val="lt-LT"/>
-              </w:rPr>
-            </w:pPr>
-            <w:proofErr w:type="spellStart"/>
-            <w:r>
-              <w:rPr>
-                <w:lang w:val="lt-LT"/>
-              </w:rPr>
-              <w:t>Profile</w:t>
-            </w:r>
-            <w:proofErr w:type="spellEnd"/>
-          </w:p>
-        </w:tc>
-        <w:tc>
-          <w:tcPr>
-            <w:tcW w:w="1812" w:type="dxa"/>
-          </w:tcPr>
-          <w:p>
-            <w:pPr>
-              <w:rPr>
-                <w:lang w:val="ru-RU"/>
-              </w:rPr>
-            </w:pPr>
-            <w:r>
-              <w:rPr>
-                <w:lang w:val="lt-LT"/>
-              </w:rPr>
-              <w:t>Išsaugomi atnaujinti duomenys</w:t>
-            </w:r>
-          </w:p>
-        </w:tc>
-        <w:tc>
-          <w:tcPr>
-            <w:tcW w:w="1813" w:type="dxa"/>
-          </w:tcPr>
-          <w:p>
-            <w:pPr>
-              <w:rPr>
-                <w:lang w:val="lt-LT"/>
-              </w:rPr>
-            </w:pPr>
-            <w:r>
-              <w:rPr>
-                <w:lang w:val="lt-LT"/>
-              </w:rPr>
-              <w:t>Išsaugomi profilio duomenys</w:t>
-            </w:r>
-          </w:p>
-        </w:tc>
-        <w:tc>
-          <w:tcPr>
-            <w:tcW w:w="1813" w:type="dxa"/>
-          </w:tcPr>
-          <w:p>
-            <w:pPr>
-              <w:rPr>
-                <w:lang w:val="lt-LT"/>
-              </w:rPr>
-            </w:pPr>
-            <w:r>
-              <w:t>userHook: mockUserData = { userName: "username1", weight: 70, height: 175, age: 30 }</w:t>
-            </w:r>
-          </w:p>
-        </w:tc>
-      </w:tr>
-      <w:tr>
-        <w:tc>
-          <w:tcPr>
-            <w:tcW w:w="1812" w:type="dxa"/>
-          </w:tcPr>
-          <w:p>
-            <w:pPr>
-              <w:rPr>
-                <w:lang w:val="en-US"/>
-              </w:rPr>
-            </w:pPr>
-            <w:r>
-              <w:rPr>
-                <w:lang w:val="en-US"/>
-              </w:rPr>
-              <w:t>#</w:t>
-            </w:r>
-            <w:r>
-              <w:rPr>
-                <w:lang w:val="lt-LT"/>
-              </w:rPr>
-              <w:t>UNIFIT-</w:t>
-            </w:r>
-            <w:r>
-              <w:rPr>
-                <w:lang w:val="en-US"/>
-              </w:rPr>
-              <w:t>18</w:t>
-            </w:r>
-          </w:p>
-        </w:tc>
-        <w:tc>
-          <w:tcPr>
-            <w:tcW w:w="1812" w:type="dxa"/>
-          </w:tcPr>
-          <w:p>
-            <w:pPr>
-              <w:rPr>
-                <w:lang w:val="lt-LT"/>
-              </w:rPr>
-            </w:pPr>
-            <w:proofErr w:type="spellStart"/>
-            <w:r>
-              <w:rPr>
-                <w:lang w:val="lt-LT"/>
-              </w:rPr>
-              <w:t>Store</w:t>
-            </w:r>
-            <w:proofErr w:type="spellEnd"/>
-          </w:p>
-        </w:tc>
-        <w:tc>
-          <w:tcPr>
-            <w:tcW w:w="1812" w:type="dxa"/>
-          </w:tcPr>
-          <w:p>
-            <w:pPr>
-              <w:rPr>
-                <w:lang w:val="lt-LT"/>
-              </w:rPr>
-            </w:pPr>
-            <w:r>
-              <w:t>Rodo vartotojo taškus ir parduotuvių sąrašą.</w:t>
-            </w:r>
-          </w:p>
-        </w:tc>
-        <w:tc>
-          <w:tcPr>
-            <w:tcW w:w="1813" w:type="dxa"/>
-          </w:tcPr>
-          <w:p>
-            <w:pPr>
-              <w:rPr>
-                <w:lang w:val="lt-LT"/>
-              </w:rPr>
-            </w:pPr>
-            <w:r>
-              <w:t>Rodo vartotojo bendrą taškų skaičių ir parduotuvių sąrašą.</w:t>
-            </w:r>
-          </w:p>
-        </w:tc>
-        <w:tc>
-          <w:tcPr>
-            <w:tcW w:w="1813" w:type="dxa"/>
-          </w:tcPr>
-          <w:p>
-            <w:pPr>
-              <w:rPr>
-                <w:lang w:val="lt-LT"/>
-              </w:rPr>
-            </w:pPr>
-            <w:r>
-              <w:t>useUser: mockUserPoints = 100, mockStores = [{ id: "store1", name: "Store 1" }]</w:t>
-            </w:r>
-          </w:p>
-        </w:tc>
-      </w:tr>
-      <w:tr>
-        <w:tc>
-          <w:tcPr>
-            <w:tcW w:w="1812" w:type="dxa"/>
-          </w:tcPr>
-          <w:p>
-            <w:pPr>
-              <w:rPr>
-                <w:lang w:val="lt-LT"/>
-              </w:rPr>
-            </w:pPr>
-            <w:r>
-              <w:rPr>
-                <w:lang w:val="lt-LT"/>
-              </w:rPr>
-              <w:t>#</w:t>
-            </w:r>
-            <w:r>
-              <w:rPr>
-                <w:lang w:val="lt-LT"/>
-              </w:rPr>
-              <w:t>UNIFIT-</w:t>
-            </w:r>
-            <w:r>
-              <w:rPr>
-                <w:lang w:val="lt-LT"/>
-              </w:rPr>
-              <w:t>19</w:t>
-            </w:r>
-          </w:p>
-        </w:tc>
-        <w:tc>
-          <w:tcPr>
-            <w:tcW w:w="1812" w:type="dxa"/>
-          </w:tcPr>
-          <w:p>
-            <w:pPr>
-              <w:rPr>
-                <w:lang w:val="lt-LT"/>
-              </w:rPr>
-            </w:pPr>
-            <w:proofErr w:type="spellStart"/>
-            <w:r>
-              <w:rPr>
-                <w:lang w:val="lt-LT"/>
-              </w:rPr>
-              <w:t>WaterIntake</w:t>
-            </w:r>
-            <w:proofErr w:type="spellEnd"/>
-          </w:p>
-        </w:tc>
-        <w:tc>
-          <w:tcPr>
-            <w:tcW w:w="1812" w:type="dxa"/>
-          </w:tcPr>
-          <w:p>
-            <w:pPr>
-              <w:rPr>
-                <w:lang w:val="lt-LT"/>
-              </w:rPr>
-            </w:pPr>
-            <w:r>
-              <w:t>Rodo vartotojo vandens suvartojimo duomenis.</w:t>
-            </w:r>
-          </w:p>
-        </w:tc>
-        <w:tc>
-          <w:tcPr>
-            <w:tcW w:w="1813" w:type="dxa"/>
-          </w:tcPr>
-          <w:p>
-            <w:pPr>
-              <w:rPr>
-                <w:lang w:val="lt-LT"/>
-              </w:rPr>
-            </w:pPr>
-            <w:r>
-              <w:t>Rodo vartotojo kasdienį tikslą ir vandens suvartojimo statistiką.</w:t>
-            </w:r>
-          </w:p>
-        </w:tc>
-        <w:tc>
-          <w:tcPr>
-            <w:tcW w:w="1813" w:type="dxa"/>
-          </w:tcPr>
-          <w:p>
-            <w:pPr>
-              <w:rPr>
-                <w:lang w:val="lt-LT"/>
-              </w:rPr>
-            </w:pPr>
-            <w:r>
-              <w:t>getDoc, setDoc, updateDoc: mockWaterIntakeData = { dailyGoal: 2, currentIntake: 1 }</w:t>
-            </w:r>
-          </w:p>
-        </w:tc>
-      </w:tr>
-    </w:tbl>
-    <w:p>
-      <w:pPr>
-        <w:rPr>
           <w:lang w:val="lt-LT"/>
         </w:rPr>
       </w:pPr>
     </w:p>
     <w:p>
       <w:pPr>
-        <w:pStyle w:val="Antrat2"/>
-        <w:jc w:val="center"/>
-        <w:rPr>
-          <w:sz w:val="24"/>
-          <w:szCs w:val="24"/>
+        <w:rPr>
           <w:lang w:val="lt-LT"/>
         </w:rPr>
       </w:pPr>
       <w:r>
         <w:rPr>
-          <w:sz w:val="24"/>
-          <w:szCs w:val="24"/>
-          <w:lang w:val="lt-LT"/>
-        </w:rPr>
-        <w:t>Testo Aprašymai:</w:t>
+          <w:lang w:val="lt-LT"/>
+        </w:rPr>
+        <w:br w:type="page"/>
       </w:r>
     </w:p>
     <w:p>
       <w:pPr>
-        <w:pStyle w:val="Sraopastraipa"/>
-        <w:numPr>
-          <w:ilvl w:val="0"/>
-          <w:numId w:val="11"/>
-        </w:numPr>
-        <w:rPr>
-          <w:lang w:val="lt-LT"/>
-        </w:rPr>
-      </w:pPr>
+        <w:pStyle w:val="Antrat1"/>
+        <w:tabs>
+          <w:tab w:val="left" w:pos="2590"/>
+        </w:tabs>
+        <w:rPr>
+          <w:lang w:val="lt-LT"/>
+        </w:rPr>
+      </w:pPr>
+      <w:bookmarkStart w:id="2" w:name="_Toc182231108"/>
       <w:r>
         <w:rPr>
-          <w:b/>
-          <w:bCs/>
-          <w:lang w:val="lt-LT"/>
-        </w:rPr>
-        <w:t xml:space="preserve">#1 </w:t>
+          <w:lang w:val="lt-LT"/>
+        </w:rPr>
+        <w:lastRenderedPageBreak/>
+        <w:t>Kodo peržiūra</w:t>
       </w:r>
-      <w:proofErr w:type="spellStart"/>
+      <w:bookmarkEnd w:id="2"/>
       <w:r>
         <w:rPr>
-          <w:b/>
-          <w:bCs/>
-          <w:lang w:val="lt-LT"/>
-        </w:rPr>
-        <w:t>Login</w:t>
-      </w:r>
-      <w:proofErr w:type="spellEnd"/>
-      <w:r>
-        <w:rPr>
-          <w:b/>
-          <w:bCs/>
-          <w:lang w:val="lt-LT"/>
-        </w:rPr>
-        <w:t xml:space="preserve"> - Ekrano elementų atvaizdavimas</w:t>
-      </w:r>
-      <w:r>
-        <w:rPr>
-          <w:lang w:val="lt-LT"/>
-        </w:rPr>
-        <w:t xml:space="preserve">: Šis testas tikrina, ar </w:t>
-      </w:r>
-      <w:proofErr w:type="spellStart"/>
-      <w:r>
-        <w:rPr>
-          <w:lang w:val="lt-LT"/>
-        </w:rPr>
-        <w:t>login</w:t>
-      </w:r>
-      <w:proofErr w:type="spellEnd"/>
-      <w:r>
-        <w:rPr>
-          <w:lang w:val="lt-LT"/>
-        </w:rPr>
-        <w:t xml:space="preserve"> ekrano elementai (pvz., mygtukai, laukeliai) yra matomi vartotojui. Tai yra svarbu, kad vartotojas galėtų bendrauti su sistema.</w:t>
+          <w:lang w:val="lt-LT"/>
+        </w:rPr>
+        <w:tab/>
       </w:r>
     </w:p>
     <w:p>
       <w:pPr>
-        <w:pStyle w:val="Sraopastraipa"/>
-        <w:numPr>
-          <w:ilvl w:val="0"/>
-          <w:numId w:val="11"/>
-        </w:numPr>
+        <w:rPr>
+          <w:lang w:val="lt-LT"/>
+        </w:rPr>
+      </w:pPr>
+    </w:p>
+    <w:p>
+      <w:pPr>
         <w:rPr>
           <w:lang w:val="lt-LT"/>
         </w:rPr>
       </w:pPr>
       <w:r>
         <w:rPr>
-          <w:b/>
-          <w:bCs/>
-          <w:lang w:val="lt-LT"/>
-        </w:rPr>
-        <w:t xml:space="preserve">#2 </w:t>
-      </w:r>
-      <w:proofErr w:type="spellStart"/>
-      <w:r>
-        <w:rPr>
-          <w:b/>
-          <w:bCs/>
-          <w:lang w:val="lt-LT"/>
-        </w:rPr>
-        <w:t>Login</w:t>
-      </w:r>
-      <w:proofErr w:type="spellEnd"/>
-      <w:r>
-        <w:rPr>
-          <w:b/>
-          <w:bCs/>
-          <w:lang w:val="lt-LT"/>
-        </w:rPr>
-        <w:t xml:space="preserve"> - Laukų "</w:t>
-      </w:r>
-      <w:proofErr w:type="spellStart"/>
-      <w:r>
-        <w:rPr>
-          <w:b/>
-          <w:bCs/>
-          <w:lang w:val="lt-LT"/>
-        </w:rPr>
-        <w:t>Email</w:t>
-      </w:r>
-      <w:proofErr w:type="spellEnd"/>
-      <w:r>
-        <w:rPr>
-          <w:b/>
-          <w:bCs/>
-          <w:lang w:val="lt-LT"/>
-        </w:rPr>
-        <w:t>" ir "</w:t>
-      </w:r>
-      <w:proofErr w:type="spellStart"/>
-      <w:r>
-        <w:rPr>
-          <w:b/>
-          <w:bCs/>
-          <w:lang w:val="lt-LT"/>
-        </w:rPr>
-        <w:t>Password</w:t>
-      </w:r>
-      <w:proofErr w:type="spellEnd"/>
-      <w:r>
-        <w:rPr>
-          <w:b/>
-          <w:bCs/>
-          <w:lang w:val="lt-LT"/>
-        </w:rPr>
-        <w:t>" įvedimas</w:t>
-      </w:r>
-      <w:r>
-        <w:rPr>
-          <w:lang w:val="lt-LT"/>
-        </w:rPr>
-        <w:t>: Testas patikrina, ar vartotojas gali sėkmingai įvesti savo el. pašto adresą ir slaptažodį. Tai yra esminis žingsnis, leidžiantis vartotojui prisijungti.</w:t>
+          <w:lang w:val="lt-LT"/>
+        </w:rPr>
+        <w:br w:type="page"/>
       </w:r>
     </w:p>
     <w:p>
       <w:pPr>
-        <w:pStyle w:val="Sraopastraipa"/>
-        <w:numPr>
-          <w:ilvl w:val="0"/>
-          <w:numId w:val="11"/>
-        </w:numPr>
-        <w:rPr>
-          <w:lang w:val="lt-LT"/>
-        </w:rPr>
-      </w:pPr>
+        <w:pStyle w:val="Antrat1"/>
+        <w:rPr>
+          <w:lang w:val="lt-LT"/>
+        </w:rPr>
+      </w:pPr>
+      <w:bookmarkStart w:id="3" w:name="_Toc182231109"/>
       <w:r>
         <w:rPr>
-          <w:b/>
-          <w:bCs/>
-          <w:lang w:val="lt-LT"/>
-        </w:rPr>
-        <w:t xml:space="preserve">#3 </w:t>
+          <w:lang w:val="lt-LT"/>
+        </w:rPr>
+        <w:lastRenderedPageBreak/>
+        <w:t>Statinė kodo analizė</w:t>
       </w:r>
-      <w:proofErr w:type="spellStart"/>
+      <w:bookmarkEnd w:id="3"/>
+    </w:p>
+    <w:p>
+      <w:pPr>
+        <w:rPr>
+          <w:lang w:val="lt-LT"/>
+        </w:rPr>
+      </w:pPr>
+    </w:p>
+    <w:p>
+      <w:pPr>
+        <w:rPr>
+          <w:lang w:val="lt-LT"/>
+        </w:rPr>
+      </w:pPr>
       <w:r>
         <w:rPr>
-          <w:b/>
-          <w:bCs/>
-          <w:lang w:val="lt-LT"/>
-        </w:rPr>
-        <w:t>Register</w:t>
-      </w:r>
-      <w:proofErr w:type="spellEnd"/>
-      <w:r>
-        <w:rPr>
-          <w:b/>
-          <w:bCs/>
-          <w:lang w:val="lt-LT"/>
-        </w:rPr>
-        <w:t xml:space="preserve"> - Registracijos formos atvaizdavimas</w:t>
-      </w:r>
-      <w:r>
-        <w:rPr>
-          <w:lang w:val="lt-LT"/>
-        </w:rPr>
-        <w:t>: Testuojama, ar registracijos forma tinkamai atvaizduojama vartotojui. Tai būtina, kad vartotojas galėtų užsiregistruoti.</w:t>
+          <w:lang w:val="lt-LT"/>
+        </w:rPr>
+        <w:br w:type="page"/>
       </w:r>
     </w:p>
     <w:p>
       <w:pPr>
-        <w:pStyle w:val="Sraopastraipa"/>
-        <w:numPr>
-          <w:ilvl w:val="0"/>
-          <w:numId w:val="11"/>
-        </w:numPr>
-        <w:rPr>
-          <w:lang w:val="lt-LT"/>
-        </w:rPr>
-      </w:pPr>
+        <w:pStyle w:val="Antrat1"/>
+        <w:rPr>
+          <w:lang w:val="lt-LT"/>
+        </w:rPr>
+      </w:pPr>
+      <w:bookmarkStart w:id="4" w:name="_Toc182231110"/>
       <w:r>
         <w:rPr>
-          <w:b/>
-          <w:bCs/>
-          <w:lang w:val="lt-LT"/>
-        </w:rPr>
-        <w:t xml:space="preserve">#4 </w:t>
+          <w:lang w:val="lt-LT"/>
+        </w:rPr>
+        <w:lastRenderedPageBreak/>
+        <w:t>Statinės kodo analizės taisyklės</w:t>
       </w:r>
-      <w:proofErr w:type="spellStart"/>
+      <w:bookmarkEnd w:id="4"/>
+    </w:p>
+    <w:p>
+      <w:pPr>
+        <w:rPr>
+          <w:lang w:val="lt-LT"/>
+        </w:rPr>
+      </w:pPr>
+    </w:p>
+    <w:p>
+      <w:pPr>
+        <w:rPr>
+          <w:lang w:val="lt-LT"/>
+        </w:rPr>
+      </w:pPr>
       <w:r>
         <w:rPr>
-          <w:b/>
-          <w:bCs/>
-          <w:lang w:val="lt-LT"/>
-        </w:rPr>
-        <w:t>Register</w:t>
-      </w:r>
-      <w:proofErr w:type="spellEnd"/>
-      <w:r>
-        <w:rPr>
-          <w:b/>
-          <w:bCs/>
-          <w:lang w:val="lt-LT"/>
-        </w:rPr>
-        <w:t xml:space="preserve"> - Laukų "</w:t>
-      </w:r>
-      <w:proofErr w:type="spellStart"/>
-      <w:r>
-        <w:rPr>
-          <w:b/>
-          <w:bCs/>
-          <w:lang w:val="lt-LT"/>
-        </w:rPr>
-        <w:t>Email</w:t>
-      </w:r>
-      <w:proofErr w:type="spellEnd"/>
-      <w:r>
-        <w:rPr>
-          <w:b/>
-          <w:bCs/>
-          <w:lang w:val="lt-LT"/>
-        </w:rPr>
-        <w:t>" ir "</w:t>
-      </w:r>
-      <w:proofErr w:type="spellStart"/>
-      <w:r>
-        <w:rPr>
-          <w:b/>
-          <w:bCs/>
-          <w:lang w:val="lt-LT"/>
-        </w:rPr>
-        <w:t>Password</w:t>
-      </w:r>
-      <w:proofErr w:type="spellEnd"/>
-      <w:r>
-        <w:rPr>
-          <w:b/>
-          <w:bCs/>
-          <w:lang w:val="lt-LT"/>
-        </w:rPr>
-        <w:t>" įvedimas</w:t>
-      </w:r>
-      <w:r>
-        <w:rPr>
-          <w:lang w:val="lt-LT"/>
-        </w:rPr>
-        <w:t>: Šis testas užtikrina, kad vartotojas gali įvesti savo registracijos informaciją (el. paštą ir slaptažodį).</w:t>
+          <w:lang w:val="lt-LT"/>
+        </w:rPr>
+        <w:br w:type="page"/>
       </w:r>
     </w:p>
     <w:p>
       <w:pPr>
-        <w:pStyle w:val="Sraopastraipa"/>
-        <w:numPr>
-          <w:ilvl w:val="0"/>
-          <w:numId w:val="11"/>
-        </w:numPr>
-        <w:rPr>
-          <w:lang w:val="lt-LT"/>
-        </w:rPr>
-      </w:pPr>
+        <w:pStyle w:val="Antrat1"/>
+        <w:rPr>
+          <w:lang w:val="lt-LT"/>
+        </w:rPr>
+      </w:pPr>
+      <w:bookmarkStart w:id="5" w:name="_Toc182231111"/>
       <w:r>
         <w:rPr>
-          <w:b/>
-          <w:bCs/>
           <w:lang w:val="lt-LT"/>
         </w:rPr>
         <w:lastRenderedPageBreak/>
-        <w:t xml:space="preserve">#5 </w:t>
+        <w:t>Išvados</w:t>
       </w:r>
-      <w:proofErr w:type="spellStart"/>
+      <w:bookmarkEnd w:id="5"/>
+    </w:p>
+    <w:p>
+      <w:pPr>
+        <w:rPr>
+          <w:lang w:val="lt-LT"/>
+        </w:rPr>
+      </w:pPr>
+    </w:p>
+    <w:p>
+      <w:pPr>
+        <w:rPr>
+          <w:lang w:val="lt-LT"/>
+        </w:rPr>
+      </w:pPr>
       <w:r>
         <w:rPr>
-          <w:b/>
-          <w:bCs/>
-          <w:lang w:val="lt-LT"/>
-        </w:rPr>
-        <w:t>Register</w:t>
-      </w:r>
-      <w:proofErr w:type="spellEnd"/>
-      <w:r>
-        <w:rPr>
-          <w:b/>
-          <w:bCs/>
-          <w:lang w:val="lt-LT"/>
-        </w:rPr>
-        <w:t xml:space="preserve"> - Registracijos sėkmės tvarkymas</w:t>
-      </w:r>
-      <w:r>
-        <w:rPr>
-          <w:lang w:val="lt-LT"/>
-        </w:rPr>
-        <w:t>: Testas patikrina, ar sėkmingai užregistravus vartotoją, jis nukreipiamas į prisijungimo ekraną.</w:t>
+          <w:lang w:val="lt-LT"/>
+        </w:rPr>
+        <w:br w:type="page"/>
       </w:r>
     </w:p>
     <w:p>
       <w:pPr>
-        <w:pStyle w:val="Sraopastraipa"/>
-        <w:numPr>
-          <w:ilvl w:val="0"/>
-          <w:numId w:val="11"/>
-        </w:numPr>
-        <w:rPr>
-          <w:lang w:val="lt-LT"/>
-        </w:rPr>
-      </w:pPr>
+        <w:pStyle w:val="Antrat1"/>
+        <w:rPr>
+          <w:lang w:val="lt-LT"/>
+        </w:rPr>
+      </w:pPr>
+      <w:bookmarkStart w:id="6" w:name="_Toc182231112"/>
       <w:r>
         <w:rPr>
-          <w:b/>
-          <w:bCs/>
-          <w:lang w:val="lt-LT"/>
-        </w:rPr>
-        <w:t xml:space="preserve">#6 </w:t>
+          <w:lang w:val="lt-LT"/>
+        </w:rPr>
+        <w:lastRenderedPageBreak/>
+        <w:t>Šaltiniai</w:t>
       </w:r>
-      <w:proofErr w:type="spellStart"/>
-      <w:r>
-        <w:rPr>
-          <w:b/>
-          <w:bCs/>
-          <w:lang w:val="lt-LT"/>
-        </w:rPr>
-        <w:t>Register</w:t>
-      </w:r>
-      <w:proofErr w:type="spellEnd"/>
-      <w:r>
-        <w:rPr>
-          <w:b/>
-          <w:bCs/>
-          <w:lang w:val="lt-LT"/>
-        </w:rPr>
-        <w:t xml:space="preserve"> - Klaidos pranešimo atvaizdavimas</w:t>
-      </w:r>
-      <w:r>
-        <w:rPr>
-          <w:lang w:val="lt-LT"/>
-        </w:rPr>
-        <w:t>: Testas tikrina, ar sistema teisingai reaguoja ir rodo klaidą, jei vartotojo el. pašto adresas jau naudojamas.</w:t>
-      </w:r>
+      <w:bookmarkEnd w:id="6"/>
     </w:p>
     <w:p>
       <w:pPr>
-        <w:pStyle w:val="Sraopastraipa"/>
-        <w:numPr>
-          <w:ilvl w:val="0"/>
-          <w:numId w:val="11"/>
-        </w:numPr>
-        <w:rPr>
-          <w:lang w:val="lt-LT"/>
-        </w:rPr>
-      </w:pPr>
-      <w:r>
-        <w:rPr>
-          <w:b/>
-          <w:bCs/>
-          <w:lang w:val="lt-LT"/>
-        </w:rPr>
-        <w:t xml:space="preserve">#7 </w:t>
-      </w:r>
-      <w:proofErr w:type="spellStart"/>
-      <w:r>
-        <w:rPr>
-          <w:b/>
-          <w:bCs/>
-          <w:lang w:val="lt-LT"/>
-        </w:rPr>
-        <w:t>Register</w:t>
-      </w:r>
-      <w:proofErr w:type="spellEnd"/>
-      <w:r>
-        <w:rPr>
-          <w:b/>
-          <w:bCs/>
-          <w:lang w:val="lt-LT"/>
-        </w:rPr>
-        <w:t xml:space="preserve"> - Prisijungimo ekrano atidarymas</w:t>
-      </w:r>
-      <w:r>
-        <w:rPr>
-          <w:lang w:val="lt-LT"/>
-        </w:rPr>
-        <w:t>: Šis testas užtikrina, kad vartotojas gali atidaryti prisijungimo ekraną po registracijos.</w:t>
-      </w:r>
+        <w:rPr>
+          <w:lang w:val="lt-LT"/>
+        </w:rPr>
+      </w:pPr>
     </w:p>
     <w:p>
       <w:pPr>
-        <w:pStyle w:val="Sraopastraipa"/>
-        <w:numPr>
-          <w:ilvl w:val="0"/>
-          <w:numId w:val="11"/>
-        </w:numPr>
-        <w:rPr>
-          <w:lang w:val="lt-LT"/>
-        </w:rPr>
-      </w:pPr>
-      <w:r>
-        <w:rPr>
-          <w:b/>
-          <w:bCs/>
-          <w:lang w:val="lt-LT"/>
-        </w:rPr>
-        <w:t xml:space="preserve">#8 </w:t>
-      </w:r>
-      <w:proofErr w:type="spellStart"/>
-      <w:r>
-        <w:rPr>
-          <w:b/>
-          <w:bCs/>
-          <w:lang w:val="lt-LT"/>
-        </w:rPr>
-        <w:t>ForgotPassword</w:t>
-      </w:r>
-      <w:proofErr w:type="spellEnd"/>
-      <w:r>
-        <w:rPr>
-          <w:b/>
-          <w:bCs/>
-          <w:lang w:val="lt-LT"/>
-        </w:rPr>
-        <w:t xml:space="preserve"> - Ekrano elementų atvaizdavimas</w:t>
-      </w:r>
-      <w:r>
-        <w:rPr>
-          <w:lang w:val="lt-LT"/>
-        </w:rPr>
-        <w:t>: Testuojama, ar "Pamiršote slaptažodį?" ekrano elementai yra matomi vartotojui.</w:t>
-      </w:r>
+        <w:rPr>
+          <w:lang w:val="lt-LT"/>
+        </w:rPr>
+      </w:pPr>
     </w:p>
     <w:p>
       <w:pPr>
-        <w:pStyle w:val="Sraopastraipa"/>
-        <w:numPr>
-          <w:ilvl w:val="0"/>
-          <w:numId w:val="11"/>
-        </w:numPr>
-        <w:rPr>
-          <w:lang w:val="lt-LT"/>
-        </w:rPr>
-      </w:pPr>
-      <w:r>
-        <w:rPr>
-          <w:b/>
-          <w:bCs/>
-          <w:lang w:val="lt-LT"/>
-        </w:rPr>
-        <w:t xml:space="preserve">#9 </w:t>
-      </w:r>
-      <w:proofErr w:type="spellStart"/>
-      <w:r>
-        <w:rPr>
-          <w:b/>
-          <w:bCs/>
-          <w:lang w:val="lt-LT"/>
-        </w:rPr>
-        <w:t>ForgotPassword</w:t>
-      </w:r>
-      <w:proofErr w:type="spellEnd"/>
-      <w:r>
-        <w:rPr>
-          <w:b/>
-          <w:bCs/>
-          <w:lang w:val="lt-LT"/>
-        </w:rPr>
-        <w:t xml:space="preserve"> - Tuščio el. pašto laukelio perspėjimas</w:t>
-      </w:r>
-      <w:r>
-        <w:rPr>
-          <w:lang w:val="lt-LT"/>
-        </w:rPr>
-        <w:t>: Testas tikrina, ar sistema rodo perspėjimą, kai vartotojas bando atkurti slaptažodį, nesuteikdamas el. pašto adreso.</w:t>
-      </w:r>
+        <w:rPr>
+          <w:lang w:val="lt-LT"/>
+        </w:rPr>
+      </w:pPr>
     </w:p>
     <w:p>
       <w:pPr>
-        <w:pStyle w:val="Sraopastraipa"/>
-        <w:numPr>
-          <w:ilvl w:val="0"/>
-          <w:numId w:val="11"/>
-        </w:numPr>
-        <w:rPr>
-          <w:lang w:val="lt-LT"/>
-        </w:rPr>
-      </w:pPr>
-      <w:r>
-        <w:rPr>
-          <w:b/>
-          <w:bCs/>
-          <w:lang w:val="lt-LT"/>
-        </w:rPr>
-        <w:t xml:space="preserve">#10 </w:t>
-      </w:r>
-      <w:proofErr w:type="spellStart"/>
-      <w:r>
-        <w:rPr>
-          <w:b/>
-          <w:bCs/>
-          <w:lang w:val="lt-LT"/>
-        </w:rPr>
-        <w:t>ForgotPassword</w:t>
-      </w:r>
-      <w:proofErr w:type="spellEnd"/>
-      <w:r>
-        <w:rPr>
-          <w:b/>
-          <w:bCs/>
-          <w:lang w:val="lt-LT"/>
-        </w:rPr>
-        <w:t xml:space="preserve"> - Sėkmingas slaptažodžio atkūrimas</w:t>
-      </w:r>
-      <w:r>
-        <w:rPr>
-          <w:lang w:val="lt-LT"/>
-        </w:rPr>
-        <w:t xml:space="preserve">: Testas patikrina, ar sėkmingai </w:t>
-      </w:r>
-      <w:proofErr w:type="spellStart"/>
-      <w:r>
-        <w:rPr>
-          <w:lang w:val="lt-LT"/>
-        </w:rPr>
-        <w:t>atkurus</w:t>
-      </w:r>
-      <w:proofErr w:type="spellEnd"/>
-      <w:r>
-        <w:rPr>
-          <w:lang w:val="lt-LT"/>
-        </w:rPr>
-        <w:t xml:space="preserve"> slaptažodį vartotojas nukreipiamas atgal į prisijungimo ekraną.</w:t>
-      </w:r>
+        <w:rPr>
+          <w:lang w:val="lt-LT"/>
+        </w:rPr>
+      </w:pPr>
     </w:p>
-    <w:p>
-      <w:pPr>
-        <w:pStyle w:val="Sraopastraipa"/>
-        <w:numPr>
-          <w:ilvl w:val="0"/>
-          <w:numId w:val="11"/>
-        </w:numPr>
-        <w:rPr>
-          <w:lang w:val="lt-LT"/>
-        </w:rPr>
-      </w:pPr>
-      <w:r>
-        <w:rPr>
-          <w:b/>
-          <w:bCs/>
-          <w:lang w:val="lt-LT"/>
-        </w:rPr>
-        <w:t xml:space="preserve">#11 </w:t>
-      </w:r>
-      <w:proofErr w:type="spellStart"/>
-      <w:r>
-        <w:rPr>
-          <w:b/>
-          <w:bCs/>
-          <w:lang w:val="lt-LT"/>
-        </w:rPr>
-        <w:t>ForgotPassword</w:t>
-      </w:r>
-      <w:proofErr w:type="spellEnd"/>
-      <w:r>
-        <w:rPr>
-          <w:b/>
-          <w:bCs/>
-          <w:lang w:val="lt-LT"/>
-        </w:rPr>
-        <w:t xml:space="preserve"> - Neteisingo el. pašto klaida</w:t>
-      </w:r>
-      <w:r>
-        <w:rPr>
-          <w:lang w:val="lt-LT"/>
-        </w:rPr>
-        <w:t>: Testas tikrina, ar rodoma klaida, kai vartotojas bando atkurti slaptažodį su neteisingu el. pašto adresu.</w:t>
-      </w:r>
-    </w:p>
-    <w:p>
-      <w:pPr>
-        <w:pStyle w:val="Sraopastraipa"/>
-        <w:numPr>
-          <w:ilvl w:val="0"/>
-          <w:numId w:val="11"/>
-        </w:numPr>
-        <w:rPr>
-          <w:lang w:val="lt-LT"/>
-        </w:rPr>
-      </w:pPr>
-      <w:r>
-        <w:rPr>
-          <w:b/>
-          <w:bCs/>
-          <w:lang w:val="lt-LT"/>
-        </w:rPr>
-        <w:t xml:space="preserve">#12 </w:t>
-      </w:r>
-      <w:proofErr w:type="spellStart"/>
-      <w:r>
-        <w:rPr>
-          <w:b/>
-          <w:bCs/>
-          <w:lang w:val="lt-LT"/>
-        </w:rPr>
-        <w:t>ForgotPassword</w:t>
-      </w:r>
-      <w:proofErr w:type="spellEnd"/>
-      <w:r>
-        <w:rPr>
-          <w:b/>
-          <w:bCs/>
-          <w:lang w:val="lt-LT"/>
-        </w:rPr>
-        <w:t xml:space="preserve"> - Nerasto vartotojo perspėjimas</w:t>
-      </w:r>
-      <w:r>
-        <w:rPr>
-          <w:lang w:val="lt-LT"/>
-        </w:rPr>
-        <w:t>: Testas patikrina, ar rodoma klaida, kai vartotojas bando atkurti slaptažodį su el. pašto adresu, kuris nėra registruotas.</w:t>
-      </w:r>
-    </w:p>
-    <w:p>
-      <w:pPr>
-        <w:pStyle w:val="Sraopastraipa"/>
-        <w:numPr>
-          <w:ilvl w:val="0"/>
-          <w:numId w:val="11"/>
-        </w:numPr>
-        <w:rPr>
-          <w:lang w:val="lt-LT"/>
-        </w:rPr>
-      </w:pPr>
-      <w:r>
-        <w:rPr>
-          <w:b/>
-          <w:bCs/>
-          <w:lang w:val="lt-LT"/>
-        </w:rPr>
-        <w:t xml:space="preserve">#13 </w:t>
-      </w:r>
-      <w:proofErr w:type="spellStart"/>
-      <w:r>
-        <w:rPr>
-          <w:b/>
-          <w:bCs/>
-          <w:lang w:val="lt-LT"/>
-        </w:rPr>
-        <w:t>ForgotPassword</w:t>
-      </w:r>
-      <w:proofErr w:type="spellEnd"/>
-      <w:r>
-        <w:rPr>
-          <w:b/>
-          <w:bCs/>
-          <w:lang w:val="lt-LT"/>
-        </w:rPr>
-        <w:t xml:space="preserve"> - Kitos klaidos tvarkymas</w:t>
-      </w:r>
-      <w:r>
-        <w:rPr>
-          <w:lang w:val="lt-LT"/>
-        </w:rPr>
-        <w:t>: Testas tikrina, ar sistema teisingai reaguoja ir rodo bendrą klaidos pranešimą, kai kyla kitų problemų.</w:t>
-      </w:r>
-    </w:p>
-    <w:p>
-      <w:pPr>
-        <w:pStyle w:val="Sraopastraipa"/>
-        <w:numPr>
-          <w:ilvl w:val="0"/>
-          <w:numId w:val="11"/>
-        </w:numPr>
-        <w:rPr>
-          <w:lang w:val="lt-LT"/>
-        </w:rPr>
-      </w:pPr>
-      <w:r>
-        <w:rPr>
-          <w:b/>
-          <w:bCs/>
-          <w:lang w:val="lt-LT"/>
-        </w:rPr>
-        <w:t xml:space="preserve">#14 </w:t>
-      </w:r>
-      <w:proofErr w:type="spellStart"/>
-      <w:r>
-        <w:rPr>
-          <w:b/>
-          <w:bCs/>
-          <w:lang w:val="lt-LT"/>
-        </w:rPr>
-        <w:t>Home</w:t>
-      </w:r>
-      <w:proofErr w:type="spellEnd"/>
-      <w:r>
-        <w:rPr>
-          <w:b/>
-          <w:bCs/>
-          <w:lang w:val="lt-LT"/>
-        </w:rPr>
-        <w:t xml:space="preserve"> - Ekrano elementų atvaizdavimas</w:t>
-      </w:r>
-      <w:r>
-        <w:rPr>
-          <w:lang w:val="lt-LT"/>
-        </w:rPr>
-        <w:t>: Testuojama, ar pagrindinio ekrano elementai (pvz., turinys, meniu) yra matomi vartotojui.</w:t>
-      </w:r>
-    </w:p>
-    <w:p>
-      <w:pPr>
-        <w:pStyle w:val="Sraopastraipa"/>
-        <w:numPr>
-          <w:ilvl w:val="0"/>
-          <w:numId w:val="11"/>
-        </w:numPr>
-        <w:rPr>
-          <w:lang w:val="lt-LT"/>
-        </w:rPr>
-      </w:pPr>
-      <w:r>
-        <w:rPr>
-          <w:b/>
-          <w:bCs/>
-          <w:lang w:val="lt-LT"/>
-        </w:rPr>
-        <w:t xml:space="preserve">#15 </w:t>
-      </w:r>
-      <w:proofErr w:type="spellStart"/>
-      <w:r>
-        <w:rPr>
-          <w:b/>
-          <w:bCs/>
-          <w:lang w:val="lt-LT"/>
-        </w:rPr>
-        <w:t>Map</w:t>
-      </w:r>
-      <w:proofErr w:type="spellEnd"/>
-      <w:r>
-        <w:rPr>
-          <w:b/>
-          <w:bCs/>
-          <w:lang w:val="lt-LT"/>
-        </w:rPr>
-        <w:t xml:space="preserve"> - Karštųjų zonų atvaizdavimas</w:t>
-      </w:r>
-      <w:r>
-        <w:rPr>
-          <w:lang w:val="lt-LT"/>
-        </w:rPr>
-        <w:t>: Testas patikrina, ar karštosios zonos yra teisingai atvaizduojamos ekrane, kad vartotojas galėtų jas matyti.</w:t>
-      </w:r>
-    </w:p>
-    <w:p>
-      <w:pPr>
-        <w:pStyle w:val="Sraopastraipa"/>
-        <w:numPr>
-          <w:ilvl w:val="0"/>
-          <w:numId w:val="11"/>
-        </w:numPr>
-        <w:rPr>
-          <w:lang w:val="lt-LT"/>
-        </w:rPr>
-      </w:pPr>
-      <w:r>
-        <w:rPr>
-          <w:b/>
-          <w:bCs/>
-          <w:lang w:val="lt-LT"/>
-        </w:rPr>
-        <w:t xml:space="preserve">#16 </w:t>
-      </w:r>
-      <w:proofErr w:type="spellStart"/>
-      <w:r>
-        <w:rPr>
-          <w:b/>
-          <w:bCs/>
-          <w:lang w:val="lt-LT"/>
-        </w:rPr>
-        <w:t>Missions</w:t>
-      </w:r>
-      <w:proofErr w:type="spellEnd"/>
-      <w:r>
-        <w:rPr>
-          <w:b/>
-          <w:bCs/>
-          <w:lang w:val="lt-LT"/>
-        </w:rPr>
-        <w:t xml:space="preserve"> - Turėtų rodyti misijas, kai jos sėkmingai įkeliamos</w:t>
-      </w:r>
-      <w:r>
-        <w:rPr>
-          <w:lang w:val="lt-LT"/>
-        </w:rPr>
-        <w:t>: Testas tikrina, ar sistema rodo misijų aprašymus, kai jie sėkmingai užkraunami.</w:t>
-      </w:r>
-    </w:p>
-    <w:p>
-      <w:pPr>
-        <w:pStyle w:val="Sraopastraipa"/>
-        <w:numPr>
-          <w:ilvl w:val="0"/>
-          <w:numId w:val="11"/>
-        </w:numPr>
-        <w:rPr>
-          <w:lang w:val="lt-LT"/>
-        </w:rPr>
-      </w:pPr>
-      <w:r>
-        <w:rPr>
-          <w:b/>
-          <w:bCs/>
-          <w:lang w:val="lt-LT"/>
-        </w:rPr>
-        <w:t xml:space="preserve">#17 </w:t>
-      </w:r>
-      <w:proofErr w:type="spellStart"/>
-      <w:r>
-        <w:rPr>
-          <w:b/>
-          <w:bCs/>
-          <w:lang w:val="lt-LT"/>
-        </w:rPr>
-        <w:t>Profile</w:t>
-      </w:r>
-      <w:proofErr w:type="spellEnd"/>
-      <w:r>
-        <w:rPr>
-          <w:b/>
-          <w:bCs/>
-          <w:lang w:val="lt-LT"/>
-        </w:rPr>
-        <w:t xml:space="preserve"> - Išsaugomi atnaujinti duomenys</w:t>
-      </w:r>
-      <w:r>
-        <w:rPr>
-          <w:lang w:val="lt-LT"/>
-        </w:rPr>
-        <w:t>: Testas patikrina, ar vartotojo profilio duomenys tinkamai išsaugomi po atnaujinimo.</w:t>
-      </w:r>
-    </w:p>
-    <w:p>
-      <w:pPr>
-        <w:pStyle w:val="Sraopastraipa"/>
-        <w:numPr>
-          <w:ilvl w:val="0"/>
-          <w:numId w:val="11"/>
-        </w:numPr>
-        <w:rPr>
-          <w:lang w:val="lt-LT"/>
-        </w:rPr>
-      </w:pPr>
-      <w:r>
-        <w:rPr>
-          <w:b/>
-          <w:bCs/>
-          <w:lang w:val="lt-LT"/>
-        </w:rPr>
-        <w:t xml:space="preserve">#18 </w:t>
-      </w:r>
-      <w:proofErr w:type="spellStart"/>
-      <w:r>
-        <w:rPr>
-          <w:b/>
-          <w:bCs/>
-          <w:lang w:val="lt-LT"/>
-        </w:rPr>
-        <w:t>Store</w:t>
-      </w:r>
-      <w:proofErr w:type="spellEnd"/>
-      <w:r>
-        <w:rPr>
-          <w:b/>
-          <w:bCs/>
-          <w:lang w:val="lt-LT"/>
-        </w:rPr>
-        <w:t xml:space="preserve"> - Rodo vartotojo taškus ir parduotuvių sąrašą</w:t>
-      </w:r>
-      <w:r>
-        <w:rPr>
-          <w:lang w:val="lt-LT"/>
-        </w:rPr>
-        <w:t>: Testas tikrina, ar vartotojo taškų skaičius ir parduotuvių sąrašas yra teisingai atvaizduojami.</w:t>
-      </w:r>
-    </w:p>
-    <w:p>
-      <w:pPr>
-        <w:pStyle w:val="Sraopastraipa"/>
-        <w:numPr>
-          <w:ilvl w:val="0"/>
-          <w:numId w:val="11"/>
-        </w:numPr>
-        <w:rPr>
-          <w:lang w:val="lt-LT"/>
-        </w:rPr>
-      </w:pPr>
-      <w:r>
-        <w:rPr>
-          <w:b/>
-          <w:bCs/>
-          <w:lang w:val="lt-LT"/>
-        </w:rPr>
-        <w:t xml:space="preserve">#19 </w:t>
-      </w:r>
-      <w:proofErr w:type="spellStart"/>
-      <w:r>
-        <w:rPr>
-          <w:b/>
-          <w:bCs/>
-          <w:lang w:val="lt-LT"/>
-        </w:rPr>
-        <w:t>WaterIntake</w:t>
-      </w:r>
-      <w:proofErr w:type="spellEnd"/>
-      <w:r>
-        <w:rPr>
-          <w:b/>
-          <w:bCs/>
-          <w:lang w:val="lt-LT"/>
-        </w:rPr>
-        <w:t xml:space="preserve"> - Rodo vartotojo vandens suvartojimo duomenis</w:t>
-      </w:r>
-      <w:r>
-        <w:rPr>
-          <w:lang w:val="lt-LT"/>
-        </w:rPr>
-        <w:t>: Testas patikrina, ar vartotojo kasdienis vandens suvartojimo tikslas ir statistika yra matomi ir teisingi.</w:t>
-      </w:r>
-    </w:p>
-    <w:p>
-      <w:pPr>
-        <w:rPr>
-          <w:lang w:val="lt-LT"/>
-        </w:rPr>
-      </w:pPr>
-    </w:p>
-    <w:p>
-      <w:pPr>
-        <w:rPr>
-          <w:lang w:val="lt-LT"/>
-        </w:rPr>
-      </w:pPr>
-    </w:p>
+    <w:p/>
+    <w:p/>
+    <w:p/>
+    <w:p/>
     <w:sectPr>
       <w:headerReference w:type="default" r:id="rId11"/>
       <w:footerReference w:type="default" r:id="rId12"/>
@@ -6312,7 +4044,7 @@
   </w:font>
   <w:font w:name="Tahoma">
     <w:panose1 w:val="020B0604030504040204"/>
-    <w:charset w:val="BA"/>
+    <w:charset w:val="00"/>
     <w:family w:val="swiss"/>
     <w:pitch w:val="variable"/>
     <w:sig w:usb0="E1002EFF" w:usb1="C000605B" w:usb2="00000029" w:usb3="00000000" w:csb0="000101FF" w:csb1="00000000"/>
@@ -6384,6 +4116,7 @@
     <w:rsid w:val="00576401"/>
     <w:rsid w:val="006556FA"/>
     <w:rsid w:val="006E40C6"/>
+    <w:rsid w:val="00717AA4"/>
     <w:rsid w:val="007207DD"/>
     <w:rsid w:val="00733289"/>
     <w:rsid w:val="00785C87"/>
@@ -6397,6 +4130,7 @@
     <w:rsid w:val="00A9636C"/>
     <w:rsid w:val="00AE4F55"/>
     <w:rsid w:val="00CC3D42"/>
+    <w:rsid w:val="00D01B66"/>
     <w:rsid w:val="00D57E71"/>
     <w:rsid w:val="00EE0EAB"/>
     <w:rsid w:val="00F130E2"/>
@@ -7148,18 +4882,6 @@
 </file>
 
 <file path=customXml/item1.xml><?xml version="1.0" encoding="utf-8"?>
-<p:properties xmlns:p="http://schemas.microsoft.com/office/2006/metadata/properties" xmlns:xsi="http://www.w3.org/2001/XMLSchema-instance" xmlns:pc="http://schemas.microsoft.com/office/infopath/2007/PartnerControls">
-  <documentManagement>
-    <_activity xmlns="def344d7-62ff-42c7-8fb5-ae3d41383d1f" xsi:nil="true"/>
-  </documentManagement>
-</p:properties>
-</file>
-
-<file path=customXml/item2.xml><?xml version="1.0" encoding="utf-8"?>
-<b:Sources xmlns:b="http://schemas.openxmlformats.org/officeDocument/2006/bibliography" xmlns="http://schemas.openxmlformats.org/officeDocument/2006/bibliography" SelectedStyle="" StyleName=""/>
-</file>
-
-<file path=customXml/item3.xml><?xml version="1.0" encoding="utf-8"?>
 <ct:contentTypeSchema xmlns:ct="http://schemas.microsoft.com/office/2006/metadata/contentType" xmlns:ma="http://schemas.microsoft.com/office/2006/metadata/properties/metaAttributes" ct:_="" ma:_="" ma:contentTypeName="Dokumentas" ma:contentTypeID="0x01010048FE8D35F5462548A6F02969ADC44E02" ma:contentTypeVersion="10" ma:contentTypeDescription="Kurkite naują dokumentą." ma:contentTypeScope="" ma:versionID="2738f332b7c68cebfc60a0407a4352de">
   <xsd:schema xmlns:xsd="http://www.w3.org/2001/XMLSchema" xmlns:xs="http://www.w3.org/2001/XMLSchema" xmlns:p="http://schemas.microsoft.com/office/2006/metadata/properties" xmlns:ns3="def344d7-62ff-42c7-8fb5-ae3d41383d1f" targetNamespace="http://schemas.microsoft.com/office/2006/metadata/properties" ma:root="true" ma:fieldsID="3ab092c38d0ca7e939c001f5dd27d4ef" ns3:_="">
     <xsd:import namespace="def344d7-62ff-42c7-8fb5-ae3d41383d1f"/>
@@ -7339,6 +5061,18 @@
 </ct:contentTypeSchema>
 </file>
 
+<file path=customXml/item2.xml><?xml version="1.0" encoding="utf-8"?>
+<b:Sources xmlns:b="http://schemas.openxmlformats.org/officeDocument/2006/bibliography" xmlns="http://schemas.openxmlformats.org/officeDocument/2006/bibliography" SelectedStyle="" StyleName=""/>
+</file>
+
+<file path=customXml/item3.xml><?xml version="1.0" encoding="utf-8"?>
+<p:properties xmlns:p="http://schemas.microsoft.com/office/2006/metadata/properties" xmlns:xsi="http://www.w3.org/2001/XMLSchema-instance" xmlns:pc="http://schemas.microsoft.com/office/infopath/2007/PartnerControls">
+  <documentManagement>
+    <_activity xmlns="def344d7-62ff-42c7-8fb5-ae3d41383d1f" xsi:nil="true"/>
+  </documentManagement>
+</p:properties>
+</file>
+
 <file path=customXml/item4.xml><?xml version="1.0" encoding="utf-8"?>
 <?mso-contentType ?>
 <FormTemplates xmlns="http://schemas.microsoft.com/sharepoint/v3/contenttype/forms">
@@ -7349,24 +5083,6 @@
 </file>
 
 <file path=customXml/itemProps1.xml><?xml version="1.0" encoding="utf-8"?>
-<ds:datastoreItem xmlns:ds="http://schemas.openxmlformats.org/officeDocument/2006/customXml" ds:itemID="{49075FCE-9006-41AF-8E31-793986AD8F23}">
-  <ds:schemaRefs>
-    <ds:schemaRef ds:uri="http://schemas.microsoft.com/office/2006/metadata/properties"/>
-    <ds:schemaRef ds:uri="http://schemas.microsoft.com/office/infopath/2007/PartnerControls"/>
-    <ds:schemaRef ds:uri="def344d7-62ff-42c7-8fb5-ae3d41383d1f"/>
-  </ds:schemaRefs>
-</ds:datastoreItem>
-</file>
-
-<file path=customXml/itemProps2.xml><?xml version="1.0" encoding="utf-8"?>
-<ds:datastoreItem xmlns:ds="http://schemas.openxmlformats.org/officeDocument/2006/customXml" ds:itemID="{DA5108E5-47DF-42DD-941E-75F0B7F3907C}">
-  <ds:schemaRefs>
-    <ds:schemaRef ds:uri="http://schemas.openxmlformats.org/officeDocument/2006/bibliography"/>
-  </ds:schemaRefs>
-</ds:datastoreItem>
-</file>
-
-<file path=customXml/itemProps3.xml><?xml version="1.0" encoding="utf-8"?>
 <ds:datastoreItem xmlns:ds="http://schemas.openxmlformats.org/officeDocument/2006/customXml" ds:itemID="{C98D5DAB-61F7-4B0E-AB91-BE26C20F452A}">
   <ds:schemaRefs>
     <ds:schemaRef ds:uri="http://schemas.microsoft.com/office/2006/metadata/contentType"/>
@@ -7384,6 +5100,24 @@
 </ds:datastoreItem>
 </file>
 
+<file path=customXml/itemProps2.xml><?xml version="1.0" encoding="utf-8"?>
+<ds:datastoreItem xmlns:ds="http://schemas.openxmlformats.org/officeDocument/2006/customXml" ds:itemID="{DA5108E5-47DF-42DD-941E-75F0B7F3907C}">
+  <ds:schemaRefs>
+    <ds:schemaRef ds:uri="http://schemas.openxmlformats.org/officeDocument/2006/bibliography"/>
+  </ds:schemaRefs>
+</ds:datastoreItem>
+</file>
+
+<file path=customXml/itemProps3.xml><?xml version="1.0" encoding="utf-8"?>
+<ds:datastoreItem xmlns:ds="http://schemas.openxmlformats.org/officeDocument/2006/customXml" ds:itemID="{49075FCE-9006-41AF-8E31-793986AD8F23}">
+  <ds:schemaRefs>
+    <ds:schemaRef ds:uri="http://schemas.microsoft.com/office/2006/metadata/properties"/>
+    <ds:schemaRef ds:uri="http://schemas.microsoft.com/office/infopath/2007/PartnerControls"/>
+    <ds:schemaRef ds:uri="def344d7-62ff-42c7-8fb5-ae3d41383d1f"/>
+  </ds:schemaRefs>
+</ds:datastoreItem>
+</file>
+
 <file path=customXml/itemProps4.xml><?xml version="1.0" encoding="utf-8"?>
 <ds:datastoreItem xmlns:ds="http://schemas.openxmlformats.org/officeDocument/2006/customXml" ds:itemID="{A543C7C0-116F-40E9-BCA9-6E67EE8B8B0C}">
   <ds:schemaRefs>

</xml_diff>